<commit_message>
Paper: follow IJCNN 2027 author instructions
Double-blind (Anonymous Authors, anonymous file metadata), single spacing, AI-generated text
cited in each section and disclosed in an acknowledgment, submission PDF (Letter, fonts embedded, 5 pages).

Co-Authored-By: Claude Opus 5.5 <noreply@anthropic.com>
</commit_message>
<xml_diff>
--- a/paper/genesis_ijcnn2027.docx
+++ b/paper/genesis_ijcnn2027.docx
@@ -14,36 +14,6 @@
           <w:szCs w:val="48"/>
         </w:rPr>
         <w:t xml:space="preserve">Told Nothing, Forgetting Little: Boundary-Blind Continual Reinforcement Learning with Competence-Gated Memory and Surprise Resets</w:t>
-      </w:r>
-    </w:p>
-    <w:p>
-      <w:pPr>
-        <w:spacing w:after="0"/>
-        <w:jc w:val="center"/>
-      </w:pPr>
-      <w:r>
-        <w:rPr>
-          <w:rFonts w:ascii="Times New Roman" w:cs="Times New Roman" w:eastAsia="Times New Roman" w:hAnsi="Times New Roman"/>
-          <w:sz w:val="22"/>
-          <w:szCs w:val="22"/>
-        </w:rPr>
-        <w:t xml:space="preserve">Rohan Kumar</w:t>
-      </w:r>
-    </w:p>
-    <w:p>
-      <w:pPr>
-        <w:spacing w:after="0"/>
-        <w:jc w:val="center"/>
-      </w:pPr>
-      <w:r>
-        <w:rPr>
-          <w:rFonts w:ascii="Times New Roman" w:cs="Times New Roman" w:eastAsia="Times New Roman" w:hAnsi="Times New Roman"/>
-          <w:i/>
-          <w:iCs/>
-          <w:sz w:val="20"/>
-          <w:szCs w:val="20"/>
-        </w:rPr>
-        <w:t xml:space="preserve">[Affiliation, City, Country]</w:t>
       </w:r>
     </w:p>
     <w:p>
@@ -60,15 +30,15 @@
       <w:r>
         <w:rPr>
           <w:rFonts w:ascii="Times New Roman" w:cs="Times New Roman" w:eastAsia="Times New Roman" w:hAnsi="Times New Roman"/>
-          <w:sz w:val="20"/>
-          <w:szCs w:val="20"/>
-        </w:rPr>
-        <w:t xml:space="preserve">[email]</w:t>
-      </w:r>
-    </w:p>
-    <w:p>
-      <w:pPr>
-        <w:spacing w:after="0" w:before="0" w:line="228" w:lineRule="auto"/>
+          <w:sz w:val="22"/>
+          <w:szCs w:val="22"/>
+        </w:rPr>
+        <w:t xml:space="preserve">Anonymous Authors</w:t>
+      </w:r>
+    </w:p>
+    <w:p>
+      <w:pPr>
+        <w:spacing w:after="0" w:before="0" w:line="240" w:lineRule="auto"/>
         <w:jc w:val="both"/>
       </w:pPr>
       <w:r>
@@ -106,7 +76,7 @@
     </w:p>
     <w:p>
       <w:pPr>
-        <w:spacing w:after="0" w:before="80" w:line="228" w:lineRule="auto"/>
+        <w:spacing w:after="0" w:before="80" w:line="240" w:lineRule="auto"/>
         <w:jc w:val="both"/>
       </w:pPr>
       <w:r>
@@ -150,7 +120,7 @@
     </w:p>
     <w:p>
       <w:pPr>
-        <w:spacing w:after="0" w:before="0" w:line="228" w:lineRule="auto"/>
+        <w:spacing w:after="0" w:before="0" w:line="240" w:lineRule="auto"/>
         <w:ind w:firstLine="202"/>
         <w:jc w:val="both"/>
       </w:pPr>
@@ -160,12 +130,12 @@
           <w:sz w:val="20"/>
           <w:szCs w:val="20"/>
         </w:rPr>
-        <w:t xml:space="preserve">A child is not told that a new task starts now. It notices that what used to work fails, adapts, and keeps what it once mastered. Most continual reinforcement learning (RL) methods [1] assume the opposite: task identities or boundaries are given, and they drive consolidation [2], [3], per-task buffers, or network resets [4]. Task-free methods exist [5], [6], [7], [8], [9]; in RL, CLEAR [10] replays all past experience with behavioural cloning and needs no labels. Separately, networks that keep training lose the ability to learn new things [11], [12], [13], [14], [15].</w:t>
-      </w:r>
-    </w:p>
-    <w:p>
-      <w:pPr>
-        <w:spacing w:after="0" w:before="0" w:line="228" w:lineRule="auto"/>
+        <w:t xml:space="preserve">A child is not told that a new task starts now. It notices that what used to work fails, adapts, and keeps what it once mastered. Most continual reinforcement learning (RL) methods [1] assume the opposite: task identities or boundaries are given, and they drive consolidation [2], [3], per-task buffers, or network resets [4]. Task-free methods exist [5], [6], [7], [8], [9]; in RL, CLEAR [10] replays all past experience with behavioural cloning and needs no labels. Separately, networks that keep training lose the ability to learn new things [11], [12], [13], [14], [15] [16].</w:t>
+      </w:r>
+    </w:p>
+    <w:p>
+      <w:pPr>
+        <w:spacing w:after="0" w:before="0" w:line="240" w:lineRule="auto"/>
         <w:ind w:firstLine="202"/>
         <w:jc w:val="both"/>
       </w:pPr>
@@ -216,7 +186,7 @@
     </w:p>
     <w:p>
       <w:pPr>
-        <w:spacing w:after="0" w:before="0" w:line="228" w:lineRule="auto"/>
+        <w:spacing w:after="0" w:before="0" w:line="240" w:lineRule="auto"/>
         <w:ind w:firstLine="202"/>
         <w:jc w:val="both"/>
       </w:pPr>
@@ -231,7 +201,7 @@
     </w:p>
     <w:p>
       <w:pPr>
-        <w:spacing w:after="0" w:before="0" w:line="228" w:lineRule="auto"/>
+        <w:spacing w:after="0" w:before="0" w:line="240" w:lineRule="auto"/>
         <w:ind w:firstLine="202"/>
         <w:jc w:val="both"/>
       </w:pPr>
@@ -262,7 +232,7 @@
     </w:p>
     <w:p>
       <w:pPr>
-        <w:spacing w:after="0" w:before="0" w:line="228" w:lineRule="auto"/>
+        <w:spacing w:after="0" w:before="0" w:line="240" w:lineRule="auto"/>
         <w:ind w:firstLine="202"/>
         <w:jc w:val="both"/>
       </w:pPr>
@@ -282,7 +252,7 @@
           <w:sz w:val="20"/>
           <w:szCs w:val="20"/>
         </w:rPr>
-        <w:t xml:space="preserve"> Networks trained on a sequence of tasks forget earlier ones. Khetarpal et al. [1] review continual RL; Wołczyk et al. [16] show that forward transfer, not only forgetting, is a key open problem. </w:t>
+        <w:t xml:space="preserve"> Networks trained on a sequence of tasks forget earlier ones. Khetarpal et al. [1] review continual RL; Wołczyk et al. [17] show that forward transfer, not only forgetting, is a key open problem. </w:t>
       </w:r>
       <w:r>
         <w:rPr>
@@ -318,7 +288,7 @@
           <w:sz w:val="20"/>
           <w:szCs w:val="20"/>
         </w:rPr>
-        <w:t xml:space="preserve"> keeps the outputs of an earlier model, e.g., Learning without Forgetting [17], policy distillation [18] and Progress &amp; Compress [3]; </w:t>
+        <w:t xml:space="preserve"> keeps the outputs of an earlier model, e.g., Learning without Forgetting [18], policy distillation [19] and Progress &amp; Compress [3]; </w:t>
       </w:r>
       <w:r>
         <w:rPr>
@@ -336,12 +306,12 @@
           <w:sz w:val="20"/>
           <w:szCs w:val="20"/>
         </w:rPr>
-        <w:t xml:space="preserve"> re-trains on stored experience [19]. CLEAR [10] combines off-policy learning and behavioural cloning from replay with on-policy learning and needs no task identities; like our agent, it is task-free, so it is our main baseline.</w:t>
-      </w:r>
-    </w:p>
-    <w:p>
-      <w:pPr>
-        <w:spacing w:after="0" w:before="0" w:line="228" w:lineRule="auto"/>
+        <w:t xml:space="preserve"> re-trains on stored experience [20]. CLEAR [10] combines off-policy learning and behavioural cloning from replay with on-policy learning and needs no task identities; like our agent, it is task-free, so it is our main baseline [16].</w:t>
+      </w:r>
+    </w:p>
+    <w:p>
+      <w:pPr>
+        <w:spacing w:after="0" w:before="0" w:line="240" w:lineRule="auto"/>
         <w:ind w:firstLine="202"/>
         <w:jc w:val="both"/>
       </w:pPr>
@@ -361,12 +331,12 @@
           <w:sz w:val="20"/>
           <w:szCs w:val="20"/>
         </w:rPr>
-        <w:t xml:space="preserve"> Aljundi et al. [5] consolidate at plateaus of the loss, without task boundaries; our rule “store only while competent” is the same spirit, in RL and with success instead of loss. CURL [6] infers tasks inside the model. In RL, OWL [7] keeps one head per task and selects a head with a bandit; 3RL [8] adds a recurrent context to SAC with replay and finds that task-agnostic learning can beat multi-task training; Dick et al. [9] detect context changes with statistical tests and train one policy per detected context. Our agent keeps a single fixed-size network, detects a change from a collapse of its own success, and gates which experience enters a reservoir [20], a strong replay memory in supervised continual learning [21].</w:t>
-      </w:r>
-    </w:p>
-    <w:p>
-      <w:pPr>
-        <w:spacing w:after="0" w:before="0" w:line="228" w:lineRule="auto"/>
+        <w:t xml:space="preserve"> Aljundi et al. [5] consolidate at plateaus of the loss, without task boundaries; our rule “store only while competent” is the same spirit, in RL and with success instead of loss. CURL [6] infers tasks inside the model. In RL, OWL [7] keeps one head per task and selects a head with a bandit; 3RL [8] adds a recurrent context to SAC with replay and finds that task-agnostic learning can beat multi-task training; Dick et al. [9] detect context changes with statistical tests and train one policy per detected context. Our agent keeps a single fixed-size network, detects a change from a collapse of its own success, and gates which experience enters a reservoir [21], a strong replay memory in supervised continual learning [22].</w:t>
+      </w:r>
+    </w:p>
+    <w:p>
+      <w:pPr>
+        <w:spacing w:after="0" w:before="0" w:line="240" w:lineRule="auto"/>
         <w:ind w:firstLine="202"/>
         <w:jc w:val="both"/>
       </w:pPr>
@@ -386,7 +356,7 @@
           <w:sz w:val="20"/>
           <w:szCs w:val="20"/>
         </w:rPr>
-        <w:t xml:space="preserve"> Networks that keep training lose plasticity [11], [12], [13]; Sokar et al. [14] relate it to dormant neurons and re-initialise them (ReDo). Nikishin et al. [15] reset the last layers, or the whole network, on a fixed schedule in single-task agents; Ash and Adams [22] shrink and perturb weights. Reset &amp; Distill [4] is the closest recipe to ours: it resets actor and critic after each task and distils old experts from small stored buffers, but it is told when each task ends. Our reset is instead triggered by self-detected surprise, and old skills return only through distillation from the competence-gated memory.</w:t>
+        <w:t xml:space="preserve"> Networks that keep training lose plasticity [11], [12], [13]; Sokar et al. [14] relate it to dormant neurons and re-initialise them (ReDo). Nikishin et al. [15] reset the last layers, or the whole network, on a fixed schedule in single-task agents; Ash and Adams [23] shrink and perturb weights. Reset &amp; Distill [4] is the closest recipe to ours: it resets actor and critic after each task and distils old experts from small stored buffers, but it is told when each task ends. Our reset is instead triggered by self-detected surprise, and old skills return only through distillation from the competence-gated memory.</w:t>
       </w:r>
     </w:p>
     <w:p>
@@ -407,7 +377,7 @@
     </w:p>
     <w:p>
       <w:pPr>
-        <w:spacing w:after="0" w:before="0" w:line="228" w:lineRule="auto"/>
+        <w:spacing w:after="0" w:before="0" w:line="240" w:lineRule="auto"/>
         <w:ind w:firstLine="202"/>
         <w:jc w:val="both"/>
       </w:pPr>
@@ -427,12 +397,12 @@
           <w:sz w:val="20"/>
           <w:szCs w:val="20"/>
         </w:rPr>
-        <w:t xml:space="preserve"> One agent faces tasks T1, T2, … in sequence, each for a fixed number of environment steps. It receives observations and rewards only; it is never given task identity, boundaries, or the number of tasks.</w:t>
-      </w:r>
-    </w:p>
-    <w:p>
-      <w:pPr>
-        <w:spacing w:after="0" w:before="0" w:line="228" w:lineRule="auto"/>
+        <w:t xml:space="preserve"> One agent faces tasks T1, T2, … in sequence, each for a fixed number of environment steps. It receives observations and rewards only; it is never given task identity, boundaries, or the number of tasks [16].</w:t>
+      </w:r>
+    </w:p>
+    <w:p>
+      <w:pPr>
+        <w:spacing w:after="0" w:before="0" w:line="240" w:lineRule="auto"/>
         <w:ind w:firstLine="202"/>
         <w:jc w:val="both"/>
       </w:pPr>
@@ -452,7 +422,7 @@
           <w:sz w:val="20"/>
           <w:szCs w:val="20"/>
         </w:rPr>
-        <w:t xml:space="preserve"> PPO [23] in a CleanRL-style implementation [24]: 16 parallel environments, 128-step rollouts, 4 epochs, 8 minibatches, Adam with learning rate 10⁻³, γ = 0.99, GAE λ = 0.95, clip 0.2, entropy coefficient 0.05, value coefficient 0.5, gradient-norm clip 0.5. A small CNN body ends in a 64-unit tanh layer, followed by linear actor and critic heads. The same settings are used for every method and both domains.</w:t>
+        <w:t xml:space="preserve"> PPO [24] in a CleanRL-style implementation [25]: 16 parallel environments, 128-step rollouts, 4 epochs, 8 minibatches, Adam with learning rate 10⁻³, γ = 0.99, GAE λ = 0.95, clip 0.2, entropy coefficient 0.05, value coefficient 0.5, gradient-norm clip 0.5. A small CNN body ends in a 64-unit tanh layer, followed by linear actor and critic heads. The same settings are used for every method and both domains.</w:t>
       </w:r>
     </w:p>
     <w:p>
@@ -526,7 +496,7 @@
     </w:p>
     <w:p>
       <w:pPr>
-        <w:spacing w:after="0" w:before="0" w:line="228" w:lineRule="auto"/>
+        <w:spacing w:after="0" w:before="0" w:line="240" w:lineRule="auto"/>
         <w:ind w:firstLine="202"/>
         <w:jc w:val="both"/>
       </w:pPr>
@@ -551,7 +521,7 @@
     </w:p>
     <w:p>
       <w:pPr>
-        <w:spacing w:after="0" w:before="0" w:line="228" w:lineRule="auto"/>
+        <w:spacing w:after="0" w:before="0" w:line="240" w:lineRule="auto"/>
         <w:ind w:firstLine="202"/>
         <w:jc w:val="both"/>
       </w:pPr>
@@ -571,7 +541,7 @@
           <w:sz w:val="20"/>
           <w:szCs w:val="20"/>
         </w:rPr>
-        <w:t xml:space="preserve"> While c ≥ m (mastery, m = 0.8), after each rollout 256 random observations of that rollout are offered, with the current policy's log-probabilities, to a reservoir of fixed size N = 8192 using reservoir sampling [20]. The memory therefore holds a uniform sample of all </w:t>
+        <w:t xml:space="preserve"> While c ≥ m (mastery, m = 0.8), after each rollout 256 random observations of that rollout are offered, with the current policy's log-probabilities, to a reservoir of fixed size N = 8192 using reservoir sampling [21]. The memory therefore holds a uniform sample of all </w:t>
       </w:r>
       <w:r>
         <w:rPr>
@@ -594,7 +564,7 @@
     </w:p>
     <w:p>
       <w:pPr>
-        <w:spacing w:after="0" w:before="0" w:line="228" w:lineRule="auto"/>
+        <w:spacing w:after="0" w:before="0" w:line="240" w:lineRule="auto"/>
         <w:ind w:firstLine="202"/>
         <w:jc w:val="both"/>
       </w:pPr>
@@ -653,7 +623,7 @@
     </w:p>
     <w:p>
       <w:pPr>
-        <w:spacing w:after="0" w:before="0" w:line="228" w:lineRule="auto"/>
+        <w:spacing w:after="0" w:before="0" w:line="240" w:lineRule="auto"/>
         <w:ind w:firstLine="202"/>
         <w:jc w:val="both"/>
       </w:pPr>
@@ -678,7 +648,7 @@
     </w:p>
     <w:p>
       <w:pPr>
-        <w:spacing w:after="0" w:before="0" w:line="228" w:lineRule="auto"/>
+        <w:spacing w:after="0" w:before="0" w:line="240" w:lineRule="auto"/>
         <w:ind w:firstLine="202"/>
         <w:jc w:val="both"/>
       </w:pPr>
@@ -719,7 +689,7 @@
     </w:p>
     <w:p>
       <w:pPr>
-        <w:spacing w:after="0" w:before="0" w:line="228" w:lineRule="auto"/>
+        <w:spacing w:after="0" w:before="0" w:line="240" w:lineRule="auto"/>
         <w:ind w:firstLine="202"/>
         <w:jc w:val="both"/>
       </w:pPr>
@@ -731,7 +701,7 @@
           <w:sz w:val="20"/>
           <w:szCs w:val="20"/>
         </w:rPr>
-        <w:t xml:space="preserve">MiniGrid [25].</w:t>
+        <w:t xml:space="preserve">MiniGrid [26].</w:t>
       </w:r>
       <w:r>
         <w:rPr>
@@ -775,12 +745,12 @@
           <w:sz w:val="20"/>
           <w:szCs w:val="20"/>
         </w:rPr>
-        <w:t xml:space="preserve"> Empty, DoorKey, LavaGap, Dynamic-Obstacles, SimpleCrossing, Unlock, DoorKey (revisit), LavaGap (revisit), 500k steps per stage; 11 tests of trained kinds and sizes plus KeyCorridor (never trained), 30 episodes each. The metric is the mean final success over the trained tests.</w:t>
-      </w:r>
-    </w:p>
-    <w:p>
-      <w:pPr>
-        <w:spacing w:after="0" w:before="0" w:line="228" w:lineRule="auto"/>
+        <w:t xml:space="preserve"> Empty, DoorKey, LavaGap, Dynamic-Obstacles, SimpleCrossing, Unlock, DoorKey (revisit), LavaGap (revisit), 500k steps per stage; 11 tests of trained kinds and sizes plus KeyCorridor (never trained), 30 episodes each. The metric is the mean final success over the trained tests [16].</w:t>
+      </w:r>
+    </w:p>
+    <w:p>
+      <w:pPr>
+        <w:spacing w:after="0" w:before="0" w:line="240" w:lineRule="auto"/>
         <w:ind w:firstLine="202"/>
         <w:jc w:val="both"/>
       </w:pPr>
@@ -792,7 +762,7 @@
           <w:sz w:val="20"/>
           <w:szCs w:val="20"/>
         </w:rPr>
-        <w:t xml:space="preserve">MinAtar [26].</w:t>
+        <w:t xml:space="preserve">MinAtar [27].</w:t>
       </w:r>
       <w:r>
         <w:rPr>
@@ -805,7 +775,7 @@
     </w:p>
     <w:p>
       <w:pPr>
-        <w:spacing w:after="0" w:before="0" w:line="228" w:lineRule="auto"/>
+        <w:spacing w:after="0" w:before="0" w:line="240" w:lineRule="auto"/>
         <w:ind w:firstLine="202"/>
         <w:jc w:val="both"/>
       </w:pPr>
@@ -938,7 +908,7 @@
     </w:p>
     <w:p>
       <w:pPr>
-        <w:spacing w:after="0" w:before="0" w:line="228" w:lineRule="auto"/>
+        <w:spacing w:after="0" w:before="0" w:line="240" w:lineRule="auto"/>
         <w:ind w:firstLine="202"/>
         <w:jc w:val="both"/>
       </w:pPr>
@@ -2392,7 +2362,7 @@
     </w:p>
     <w:p>
       <w:pPr>
-        <w:spacing w:after="0" w:before="0" w:line="228" w:lineRule="auto"/>
+        <w:spacing w:after="0" w:before="0" w:line="240" w:lineRule="auto"/>
         <w:ind w:firstLine="202"/>
         <w:jc w:val="both"/>
       </w:pPr>
@@ -2402,7 +2372,7 @@
           <w:sz w:val="20"/>
           <w:szCs w:val="20"/>
         </w:rPr>
-        <w:t xml:space="preserve">On the 8-stage sequence L1 (Table I, Fig. 2), the agent that is never told anything keeps 92.7% (worst seed 89), on par with told distillation (+1.9 ± 3.3), and above CLEAR (+24.9 ± 2.1, 20/20 seeds), joint training (+6.5 ± 4.9, 17/20) and no protection (+59.7 ± 4.6, 20/20). CLEAR keeps early tasks but learns the new kinds (Obstacles, Crossing) poorly: replaying everything holds the policy to old behaviour. KeyCorridor, never trained, stays at 0% for all methods: there is no zero-shot composition.</w:t>
+        <w:t xml:space="preserve">On the 8-stage sequence L1 (Table I, Fig. 2), the agent that is never told anything keeps 92.7% (worst seed 89), on par with told distillation (+1.9 ± 3.3), and above CLEAR (+24.9 ± 2.1, 20/20 seeds), joint training (+6.5 ± 4.9, 17/20) and no protection (+59.7 ± 4.6, 20/20). CLEAR keeps early tasks but learns the new kinds (Obstacles, Crossing) poorly: replaying everything holds the policy to old behaviour. KeyCorridor, never trained, stays at 0% for all methods: there is no zero-shot composition [16].</w:t>
       </w:r>
     </w:p>
     <w:p>
@@ -2476,7 +2446,7 @@
     </w:p>
     <w:p>
       <w:pPr>
-        <w:spacing w:after="0" w:before="0" w:line="228" w:lineRule="auto"/>
+        <w:spacing w:after="0" w:before="0" w:line="240" w:lineRule="auto"/>
         <w:ind w:firstLine="202"/>
         <w:jc w:val="both"/>
       </w:pPr>
@@ -3651,7 +3621,7 @@
     </w:p>
     <w:p>
       <w:pPr>
-        <w:spacing w:after="0" w:before="0" w:line="228" w:lineRule="auto"/>
+        <w:spacing w:after="0" w:before="0" w:line="240" w:lineRule="auto"/>
         <w:ind w:firstLine="202"/>
         <w:jc w:val="both"/>
       </w:pPr>
@@ -3751,7 +3721,7 @@
     </w:p>
     <w:p>
       <w:pPr>
-        <w:spacing w:after="0" w:before="0" w:line="228" w:lineRule="auto"/>
+        <w:spacing w:after="0" w:before="0" w:line="240" w:lineRule="auto"/>
         <w:ind w:firstLine="202"/>
         <w:jc w:val="both"/>
       </w:pPr>
@@ -4667,7 +4637,7 @@
     </w:p>
     <w:p>
       <w:pPr>
-        <w:spacing w:after="0" w:before="0" w:line="228" w:lineRule="auto"/>
+        <w:spacing w:after="0" w:before="0" w:line="240" w:lineRule="auto"/>
         <w:ind w:firstLine="202"/>
         <w:jc w:val="both"/>
       </w:pPr>
@@ -4677,7 +4647,7 @@
           <w:sz w:val="20"/>
           <w:szCs w:val="20"/>
         </w:rPr>
-        <w:t xml:space="preserve">Without the reservoir, the full reset learns each new MinAtar game at 105% of scratch, but the final score falls to 25.3% (Table III); on MiniGrid C1 it falls to 39.0%. The reset brings back the ability to learn; the memory carries the past.</w:t>
+        <w:t xml:space="preserve">Without the reservoir, the full reset learns each new MinAtar game at 105% of scratch, but the final score falls to 25.3% (Table III); on MiniGrid C1 it falls to 39.0%. The reset brings back the ability to learn; the memory carries the past [16].</w:t>
       </w:r>
     </w:p>
     <w:p>
@@ -4698,7 +4668,7 @@
     </w:p>
     <w:p>
       <w:pPr>
-        <w:spacing w:after="0" w:before="0" w:line="228" w:lineRule="auto"/>
+        <w:spacing w:after="0" w:before="0" w:line="240" w:lineRule="auto"/>
         <w:ind w:firstLine="202"/>
         <w:jc w:val="both"/>
       </w:pPr>
@@ -4798,7 +4768,7 @@
     </w:p>
     <w:p>
       <w:pPr>
-        <w:spacing w:after="0" w:before="0" w:line="228" w:lineRule="auto"/>
+        <w:spacing w:after="0" w:before="0" w:line="240" w:lineRule="auto"/>
         <w:ind w:firstLine="202"/>
         <w:jc w:val="both"/>
       </w:pPr>
@@ -4813,7 +4783,7 @@
     </w:p>
     <w:p>
       <w:pPr>
-        <w:spacing w:after="0" w:before="0" w:line="228" w:lineRule="auto"/>
+        <w:spacing w:after="0" w:before="0" w:line="240" w:lineRule="auto"/>
         <w:ind w:firstLine="202"/>
         <w:jc w:val="both"/>
       </w:pPr>
@@ -4844,7 +4814,7 @@
     </w:p>
     <w:p>
       <w:pPr>
-        <w:spacing w:after="0" w:before="0" w:line="228" w:lineRule="auto"/>
+        <w:spacing w:after="0" w:before="0" w:line="240" w:lineRule="auto"/>
         <w:ind w:firstLine="202"/>
         <w:jc w:val="both"/>
       </w:pPr>
@@ -4875,7 +4845,7 @@
     </w:p>
     <w:p>
       <w:pPr>
-        <w:spacing w:after="0" w:before="0" w:line="228" w:lineRule="auto"/>
+        <w:spacing w:after="0" w:before="0" w:line="240" w:lineRule="auto"/>
         <w:ind w:firstLine="202"/>
         <w:jc w:val="both"/>
       </w:pPr>
@@ -4906,7 +4876,7 @@
     </w:p>
     <w:p>
       <w:pPr>
-        <w:spacing w:after="0" w:before="0" w:line="228" w:lineRule="auto"/>
+        <w:spacing w:after="0" w:before="0" w:line="240" w:lineRule="auto"/>
         <w:ind w:firstLine="202"/>
         <w:jc w:val="both"/>
       </w:pPr>
@@ -4937,7 +4907,7 @@
     </w:p>
     <w:p>
       <w:pPr>
-        <w:spacing w:after="0" w:before="0" w:line="228" w:lineRule="auto"/>
+        <w:spacing w:after="0" w:before="0" w:line="240" w:lineRule="auto"/>
         <w:ind w:firstLine="202"/>
         <w:jc w:val="both"/>
       </w:pPr>
@@ -4947,7 +4917,7 @@
           <w:sz w:val="20"/>
           <w:szCs w:val="20"/>
         </w:rPr>
-        <w:t xml:space="preserve">Networks and worlds are small (MiniGrid, MinAtar), with one RL algorithm (PPO) and one set of hyperparameters. The thresholds (0.8, 0.3) and λ were set once on MiniGrid, although sensitivity is low. A slow drift that never drops competence below 0.3 would not trigger a reset (not tested). A full reset discards useful features (Sec. VI-F); choosing what to reset is open. Retention on MinAtar is partial. CLEAR and Reset &amp; Distill are our PPO adaptations, not the original implementations, and joint training is not an upper bound on MinAtar.</w:t>
+        <w:t xml:space="preserve">Networks and worlds are small (MiniGrid, MinAtar), with one RL algorithm (PPO) and one set of hyperparameters. The thresholds (0.8, 0.3) and λ were set once on MiniGrid, although sensitivity is low. A slow drift that never drops competence below 0.3 would not trigger a reset (not tested). A full reset discards useful features (Sec. VI-F); choosing what to reset is open. Retention on MinAtar is partial. CLEAR and Reset &amp; Distill are our PPO adaptations, not the original implementations, and joint training is not an upper bound on MinAtar [16].</w:t>
       </w:r>
     </w:p>
     <w:p>
@@ -4968,7 +4938,7 @@
     </w:p>
     <w:p>
       <w:pPr>
-        <w:spacing w:after="0" w:before="0" w:line="228" w:lineRule="auto"/>
+        <w:spacing w:after="0" w:before="0" w:line="240" w:lineRule="auto"/>
         <w:ind w:firstLine="202"/>
         <w:jc w:val="both"/>
       </w:pPr>
@@ -4978,12 +4948,12 @@
           <w:sz w:val="20"/>
           <w:szCs w:val="20"/>
         </w:rPr>
-        <w:t xml:space="preserve">An agent told nothing about task changes can, with a small self-triggered loop (remember what you master, distil toward it, restart when the world surprises you), match learners that are told the boundaries and beat CLEAR on two domains, with results replicated on new seeds. Memory carries the past; the reset carries the future. Next, we will ground language instructions in the same continual agent.</w:t>
-      </w:r>
-    </w:p>
-    <w:p>
-      <w:pPr>
-        <w:spacing w:after="0" w:before="80" w:line="228" w:lineRule="auto"/>
+        <w:t xml:space="preserve">An agent told nothing about task changes can, with a small self-triggered loop (remember what you master, distil toward it, restart when the world surprises you), match learners that are told the boundaries and beat CLEAR on two domains, with results replicated on new seeds. Memory carries the past; the reset carries the future. Next, we will ground language instructions in the same continual agent [16].</w:t>
+      </w:r>
+    </w:p>
+    <w:p>
+      <w:pPr>
+        <w:spacing w:after="0" w:before="80" w:line="240" w:lineRule="auto"/>
         <w:jc w:val="both"/>
       </w:pPr>
       <w:r>
@@ -5003,6 +4973,37 @@
           <w:szCs w:val="20"/>
         </w:rPr>
         <w:t xml:space="preserve"> Code, configurations, per-seed result files and logs for all runs will be released with the paper.</w:t>
+      </w:r>
+    </w:p>
+    <w:p>
+      <w:pPr>
+        <w:keepNext/>
+        <w:spacing w:after="80" w:before="160"/>
+        <w:jc w:val="center"/>
+      </w:pPr>
+      <w:r>
+        <w:rPr>
+          <w:rFonts w:ascii="Times New Roman" w:cs="Times New Roman" w:eastAsia="Times New Roman" w:hAnsi="Times New Roman"/>
+          <w:smallCaps/>
+          <w:sz w:val="20"/>
+          <w:szCs w:val="20"/>
+        </w:rPr>
+        <w:t xml:space="preserve">Acknowledgment</w:t>
+      </w:r>
+    </w:p>
+    <w:p>
+      <w:pPr>
+        <w:spacing w:after="0" w:before="0" w:line="240" w:lineRule="auto"/>
+        <w:ind w:firstLine="202"/>
+        <w:jc w:val="both"/>
+      </w:pPr>
+      <w:r>
+        <w:rPr>
+          <w:rFonts w:ascii="Times New Roman" w:cs="Times New Roman" w:eastAsia="Times New Roman" w:hAnsi="Times New Roman"/>
+          <w:sz w:val="20"/>
+          <w:szCs w:val="20"/>
+        </w:rPr>
+        <w:t xml:space="preserve">The text of all sections of this paper was generated with the AI system Claude Opus 5.5 [16], working from the authors' experiment reports; the same system also wrote the experiment, analysis and figure code under the authors' direction. The authors reviewed the paper and take full responsibility for its content.</w:t>
       </w:r>
     </w:p>
     <w:p>
@@ -5305,7 +5306,7 @@
           <w:sz w:val="16"/>
           <w:szCs w:val="16"/>
         </w:rPr>
-        <w:t xml:space="preserve">[16]	M. Wołczyk, M. Zając, R. Pascanu, Ł. Kuciński, and P. Miłoś, "Continual World: A robotic benchmark for continual reinforcement learning," in Proc. NeurIPS, vol. 34, 2021.</w:t>
+        <w:t xml:space="preserve">[16]	Anthropic, "Claude Opus 5.5 (claude-opus-5-5)," large language model, 2026. [Online]. Available: https://www.anthropic.com/claude</w:t>
       </w:r>
     </w:p>
     <w:p>
@@ -5323,7 +5324,7 @@
           <w:sz w:val="16"/>
           <w:szCs w:val="16"/>
         </w:rPr>
-        <w:t xml:space="preserve">[17]	Z. Li and D. Hoiem, "Learning without forgetting," in Proc. ECCV, 2016, pp. 614–629.</w:t>
+        <w:t xml:space="preserve">[17]	M. Wołczyk, M. Zając, R. Pascanu, Ł. Kuciński, and P. Miłoś, "Continual World: A robotic benchmark for continual reinforcement learning," in Proc. NeurIPS, vol. 34, 2021.</w:t>
       </w:r>
     </w:p>
     <w:p>
@@ -5341,7 +5342,7 @@
           <w:sz w:val="16"/>
           <w:szCs w:val="16"/>
         </w:rPr>
-        <w:t xml:space="preserve">[18]	A. A. Rusu et al., "Policy distillation," in Proc. ICLR, 2016.</w:t>
+        <w:t xml:space="preserve">[18]	Z. Li and D. Hoiem, "Learning without forgetting," in Proc. ECCV, 2016, pp. 614–629.</w:t>
       </w:r>
     </w:p>
     <w:p>
@@ -5359,7 +5360,7 @@
           <w:sz w:val="16"/>
           <w:szCs w:val="16"/>
         </w:rPr>
-        <w:t xml:space="preserve">[19]	D. Isele and A. Cosgun, "Selective experience replay for lifelong learning," in Proc. AAAI, vol. 32, no. 1, 2018.</w:t>
+        <w:t xml:space="preserve">[19]	A. A. Rusu et al., "Policy distillation," in Proc. ICLR, 2016.</w:t>
       </w:r>
     </w:p>
     <w:p>
@@ -5377,7 +5378,7 @@
           <w:sz w:val="16"/>
           <w:szCs w:val="16"/>
         </w:rPr>
-        <w:t xml:space="preserve">[20]	J. S. Vitter, "Random sampling with a reservoir," ACM Trans. Math. Softw., vol. 11, no. 1, pp. 37–57, 1985.</w:t>
+        <w:t xml:space="preserve">[20]	D. Isele and A. Cosgun, "Selective experience replay for lifelong learning," in Proc. AAAI, vol. 32, no. 1, 2018.</w:t>
       </w:r>
     </w:p>
     <w:p>
@@ -5395,7 +5396,7 @@
           <w:sz w:val="16"/>
           <w:szCs w:val="16"/>
         </w:rPr>
-        <w:t xml:space="preserve">[21]	A. Chaudhry et al., "On tiny episodic memories in continual learning," arXiv:1902.10486, 2019.</w:t>
+        <w:t xml:space="preserve">[21]	J. S. Vitter, "Random sampling with a reservoir," ACM Trans. Math. Softw., vol. 11, no. 1, pp. 37–57, 1985.</w:t>
       </w:r>
     </w:p>
     <w:p>
@@ -5413,7 +5414,7 @@
           <w:sz w:val="16"/>
           <w:szCs w:val="16"/>
         </w:rPr>
-        <w:t xml:space="preserve">[22]	J. Ash and R. P. Adams, "On warm-starting neural network training," in Proc. NeurIPS, vol. 33, 2020.</w:t>
+        <w:t xml:space="preserve">[22]	A. Chaudhry et al., "On tiny episodic memories in continual learning," arXiv:1902.10486, 2019.</w:t>
       </w:r>
     </w:p>
     <w:p>
@@ -5431,7 +5432,7 @@
           <w:sz w:val="16"/>
           <w:szCs w:val="16"/>
         </w:rPr>
-        <w:t xml:space="preserve">[23]	J. Schulman, F. Wolski, P. Dhariwal, A. Radford, and O. Klimov, "Proximal policy optimization algorithms," arXiv:1707.06347, 2017.</w:t>
+        <w:t xml:space="preserve">[23]	J. Ash and R. P. Adams, "On warm-starting neural network training," in Proc. NeurIPS, vol. 33, 2020.</w:t>
       </w:r>
     </w:p>
     <w:p>
@@ -5449,7 +5450,7 @@
           <w:sz w:val="16"/>
           <w:szCs w:val="16"/>
         </w:rPr>
-        <w:t xml:space="preserve">[24]	S. Huang et al., "CleanRL: High-quality single-file implementations of deep reinforcement learning algorithms," J. Mach. Learn. Res., vol. 23, no. 274, pp. 1–18, 2022.</w:t>
+        <w:t xml:space="preserve">[24]	J. Schulman, F. Wolski, P. Dhariwal, A. Radford, and O. Klimov, "Proximal policy optimization algorithms," arXiv:1707.06347, 2017.</w:t>
       </w:r>
     </w:p>
     <w:p>
@@ -5467,7 +5468,7 @@
           <w:sz w:val="16"/>
           <w:szCs w:val="16"/>
         </w:rPr>
-        <w:t xml:space="preserve">[25]	M. Chevalier-Boisvert et al., "Minigrid &amp; Miniworld: Modular &amp; customizable reinforcement learning environments for goal-oriented tasks," in Proc. NeurIPS Datasets and Benchmarks Track, 2023.</w:t>
+        <w:t xml:space="preserve">[25]	S. Huang et al., "CleanRL: High-quality single-file implementations of deep reinforcement learning algorithms," J. Mach. Learn. Res., vol. 23, no. 274, pp. 1–18, 2022.</w:t>
       </w:r>
     </w:p>
     <w:p>
@@ -5485,7 +5486,25 @@
           <w:sz w:val="16"/>
           <w:szCs w:val="16"/>
         </w:rPr>
-        <w:t xml:space="preserve">[26]	K. Young and T. Tian, "MinAtar: An Atari-inspired testbed for thorough and reproducible reinforcement learning experiments," arXiv:1903.03176, 2019.</w:t>
+        <w:t xml:space="preserve">[26]	M. Chevalier-Boisvert et al., "Minigrid &amp; Miniworld: Modular &amp; customizable reinforcement learning environments for goal-oriented tasks," in Proc. NeurIPS Datasets and Benchmarks Track, 2023.</w:t>
+      </w:r>
+    </w:p>
+    <w:p>
+      <w:pPr>
+        <w:tabs>
+          <w:tab w:val="left" w:pos="360"/>
+        </w:tabs>
+        <w:spacing w:after="20" w:before="0" w:line="200" w:lineRule="auto"/>
+        <w:ind w:left="360" w:hanging="360"/>
+        <w:jc w:val="both"/>
+      </w:pPr>
+      <w:r>
+        <w:rPr>
+          <w:rFonts w:ascii="Times New Roman" w:cs="Times New Roman" w:eastAsia="Times New Roman" w:hAnsi="Times New Roman"/>
+          <w:sz w:val="16"/>
+          <w:szCs w:val="16"/>
+        </w:rPr>
+        <w:t xml:space="preserve">[27]	K. Young and T. Tian, "MinAtar: An Atari-inspired testbed for thorough and reproducible reinforcement learning experiments," arXiv:1903.03176, 2019.</w:t>
       </w:r>
     </w:p>
     <w:sectPr>

</xml_diff>

<commit_message>
Paper: comparison table, Algorithm 1, significance rule, AI note per section; release README/LICENSE
- Table I: how the method differs from related work (boundaries, memory, reset trigger/scope)
- Algorithm 1 from ppo.py Life.update (order of competence, storing, surprise reset, distillation)
- Protocol: significant only if paired 95% CI excludes zero
- AI citation moved to an italic note under each section heading (IJCNN 2027 rule), not inside claims
- README with reproduction commands, MIT license, MinAtar from PyPI instead of a local wheel

Co-Authored-By: Claude Opus 5.5 <noreply@anthropic.com>
</commit_message>
<xml_diff>
--- a/paper/genesis_ijcnn2027.docx
+++ b/paper/genesis_ijcnn2027.docx
@@ -105,7 +105,7 @@
     <w:p>
       <w:pPr>
         <w:keepNext/>
-        <w:spacing w:after="80" w:before="160"/>
+        <w:spacing w:after="20" w:before="160"/>
         <w:jc w:val="center"/>
       </w:pPr>
       <w:r>
@@ -116,6 +116,41 @@
           <w:szCs w:val="20"/>
         </w:rPr>
         <w:t xml:space="preserve">I. Introduction</w:t>
+      </w:r>
+    </w:p>
+    <w:p>
+      <w:pPr>
+        <w:keepNext/>
+        <w:spacing w:after="60" w:before="0"/>
+        <w:jc w:val="center"/>
+      </w:pPr>
+      <w:r>
+        <w:rPr>
+          <w:rFonts w:ascii="Times New Roman" w:cs="Times New Roman" w:eastAsia="Times New Roman" w:hAnsi="Times New Roman"/>
+          <w:i/>
+          <w:iCs/>
+          <w:sz w:val="16"/>
+          <w:szCs w:val="16"/>
+        </w:rPr>
+        <w:t xml:space="preserve">AI-generated text in this section</w:t>
+      </w:r>
+      <w:r>
+        <w:rPr>
+          <w:rFonts w:ascii="Times New Roman" w:cs="Times New Roman" w:eastAsia="Times New Roman" w:hAnsi="Times New Roman"/>
+          <w:sz w:val="16"/>
+          <w:szCs w:val="16"/>
+        </w:rPr>
+        <w:t xml:space="preserve"> [1]</w:t>
+      </w:r>
+      <w:r>
+        <w:rPr>
+          <w:rFonts w:ascii="Times New Roman" w:cs="Times New Roman" w:eastAsia="Times New Roman" w:hAnsi="Times New Roman"/>
+          <w:i/>
+          <w:iCs/>
+          <w:sz w:val="16"/>
+          <w:szCs w:val="16"/>
+        </w:rPr>
+        <w:t xml:space="preserve">.</w:t>
       </w:r>
     </w:p>
     <w:p>
@@ -130,7 +165,7 @@
           <w:sz w:val="20"/>
           <w:szCs w:val="20"/>
         </w:rPr>
-        <w:t xml:space="preserve">A child is not told that a new task starts now. It notices that what used to work fails, adapts, and keeps what it once mastered. Most continual reinforcement learning (RL) methods [1] assume the opposite: task identities or boundaries are given, and they drive consolidation [2], [3], per-task buffers, or network resets [4]. Task-free methods exist [5], [6], [7], [8], [9]; in RL, CLEAR [10] replays all past experience with behavioural cloning and needs no labels. Separately, networks that keep training lose the ability to learn new things [11], [12], [13], [14], [15] [16].</w:t>
+        <w:t xml:space="preserve">A child is not told that a new task starts now. It notices that what used to work fails, adapts, and keeps what it once mastered. Most continual reinforcement learning (RL) methods [2] assume the opposite: task identities or boundaries are given, and they drive consolidation [3], [4], per-task buffers, or network resets [5]. Task-free methods exist [6], [7], [8], [9], [10]; in RL, CLEAR [11] replays all past experience with behavioural cloning and needs no labels. Separately, networks that keep training lose the ability to learn new things [12], [13], [14], [15], [16].</w:t>
       </w:r>
     </w:p>
     <w:p>
@@ -217,7 +252,7 @@
     <w:p>
       <w:pPr>
         <w:keepNext/>
-        <w:spacing w:after="80" w:before="160"/>
+        <w:spacing w:after="20" w:before="160"/>
         <w:jc w:val="center"/>
       </w:pPr>
       <w:r>
@@ -228,6 +263,41 @@
           <w:szCs w:val="20"/>
         </w:rPr>
         <w:t xml:space="preserve">II. Related Work</w:t>
+      </w:r>
+    </w:p>
+    <w:p>
+      <w:pPr>
+        <w:keepNext/>
+        <w:spacing w:after="60" w:before="0"/>
+        <w:jc w:val="center"/>
+      </w:pPr>
+      <w:r>
+        <w:rPr>
+          <w:rFonts w:ascii="Times New Roman" w:cs="Times New Roman" w:eastAsia="Times New Roman" w:hAnsi="Times New Roman"/>
+          <w:i/>
+          <w:iCs/>
+          <w:sz w:val="16"/>
+          <w:szCs w:val="16"/>
+        </w:rPr>
+        <w:t xml:space="preserve">AI-generated text in this section</w:t>
+      </w:r>
+      <w:r>
+        <w:rPr>
+          <w:rFonts w:ascii="Times New Roman" w:cs="Times New Roman" w:eastAsia="Times New Roman" w:hAnsi="Times New Roman"/>
+          <w:sz w:val="16"/>
+          <w:szCs w:val="16"/>
+        </w:rPr>
+        <w:t xml:space="preserve"> [1]</w:t>
+      </w:r>
+      <w:r>
+        <w:rPr>
+          <w:rFonts w:ascii="Times New Roman" w:cs="Times New Roman" w:eastAsia="Times New Roman" w:hAnsi="Times New Roman"/>
+          <w:i/>
+          <w:iCs/>
+          <w:sz w:val="16"/>
+          <w:szCs w:val="16"/>
+        </w:rPr>
+        <w:t xml:space="preserve">.</w:t>
       </w:r>
     </w:p>
     <w:p>
@@ -252,7 +322,7 @@
           <w:sz w:val="20"/>
           <w:szCs w:val="20"/>
         </w:rPr>
-        <w:t xml:space="preserve"> Networks trained on a sequence of tasks forget earlier ones. Khetarpal et al. [1] review continual RL; Wołczyk et al. [17] show that forward transfer, not only forgetting, is a key open problem. </w:t>
+        <w:t xml:space="preserve"> Networks trained on a sequence of tasks forget earlier ones. Khetarpal et al. [2] review continual RL; Wołczyk et al. [17] show that forward transfer, not only forgetting, is a key open problem. </w:t>
       </w:r>
       <w:r>
         <w:rPr>
@@ -270,7 +340,7 @@
           <w:sz w:val="20"/>
           <w:szCs w:val="20"/>
         </w:rPr>
-        <w:t xml:space="preserve"> slows change of important weights, e.g., EWC [2]; </w:t>
+        <w:t xml:space="preserve"> slows change of important weights, e.g., EWC [3]; </w:t>
       </w:r>
       <w:r>
         <w:rPr>
@@ -288,7 +358,7 @@
           <w:sz w:val="20"/>
           <w:szCs w:val="20"/>
         </w:rPr>
-        <w:t xml:space="preserve"> keeps the outputs of an earlier model, e.g., Learning without Forgetting [18], policy distillation [19] and Progress &amp; Compress [3]; </w:t>
+        <w:t xml:space="preserve"> keeps the outputs of an earlier model, e.g., Learning without Forgetting [18], policy distillation [19] and Progress &amp; Compress [4]; </w:t>
       </w:r>
       <w:r>
         <w:rPr>
@@ -306,7 +376,7 @@
           <w:sz w:val="20"/>
           <w:szCs w:val="20"/>
         </w:rPr>
-        <w:t xml:space="preserve"> re-trains on stored experience [20]. CLEAR [10] combines off-policy learning and behavioural cloning from replay with on-policy learning and needs no task identities; like our agent, it is task-free, so it is our main baseline [16].</w:t>
+        <w:t xml:space="preserve"> re-trains on stored experience [20]. CLEAR [11] combines off-policy learning and behavioural cloning from replay with on-policy learning and needs no task identities; like our agent, it is task-free, so it is our main baseline.</w:t>
       </w:r>
     </w:p>
     <w:p>
@@ -331,7 +401,7 @@
           <w:sz w:val="20"/>
           <w:szCs w:val="20"/>
         </w:rPr>
-        <w:t xml:space="preserve"> Aljundi et al. [5] consolidate at plateaus of the loss, without task boundaries; our rule “store only while competent” is the same spirit, in RL and with success instead of loss. CURL [6] infers tasks inside the model. In RL, OWL [7] keeps one head per task and selects a head with a bandit; 3RL [8] adds a recurrent context to SAC with replay and finds that task-agnostic learning can beat multi-task training; Dick et al. [9] detect context changes with statistical tests and train one policy per detected context. Our agent keeps a single fixed-size network, detects a change from a collapse of its own success, and gates which experience enters a reservoir [21], a strong replay memory in supervised continual learning [22].</w:t>
+        <w:t xml:space="preserve"> Aljundi et al. [6] consolidate at plateaus of the loss, without task boundaries; our rule “store only while competent” is the same spirit, in RL and with success instead of loss. CURL [7] infers tasks inside the model. In RL, OWL [8] keeps one head per task and selects a head with a bandit; 3RL [9] adds a recurrent context to SAC with replay and finds that task-agnostic learning can beat multi-task training; Dick et al. [10] detect context changes with statistical tests and train one policy per detected context. Our agent keeps a single fixed-size network, detects a change from a collapse of its own success, and gates which experience enters a reservoir [21], a strong replay memory in supervised continual learning [22].</w:t>
       </w:r>
     </w:p>
     <w:p>
@@ -356,23 +426,7 @@
           <w:sz w:val="20"/>
           <w:szCs w:val="20"/>
         </w:rPr>
-        <w:t xml:space="preserve"> Networks that keep training lose plasticity [11], [12], [13]; Sokar et al. [14] relate it to dormant neurons and re-initialise them (ReDo). Nikishin et al. [15] reset the last layers, or the whole network, on a fixed schedule in single-task agents; Ash and Adams [23] shrink and perturb weights. Reset &amp; Distill [4] is the closest recipe to ours: it resets actor and critic after each task and distils old experts from small stored buffers, but it is told when each task ends. Our reset is instead triggered by self-detected surprise, and old skills return only through distillation from the competence-gated memory.</w:t>
-      </w:r>
-    </w:p>
-    <w:p>
-      <w:pPr>
-        <w:keepNext/>
-        <w:spacing w:after="80" w:before="160"/>
-        <w:jc w:val="center"/>
-      </w:pPr>
-      <w:r>
-        <w:rPr>
-          <w:rFonts w:ascii="Times New Roman" w:cs="Times New Roman" w:eastAsia="Times New Roman" w:hAnsi="Times New Roman"/>
-          <w:smallCaps/>
-          <w:sz w:val="20"/>
-          <w:szCs w:val="20"/>
-        </w:rPr>
-        <w:t xml:space="preserve">III. Method</w:t>
+        <w:t xml:space="preserve"> Networks that keep training lose plasticity [12], [13], [14]; Sokar et al. [15] relate it to dormant neurons and re-initialise them (ReDo). Nikishin et al. [16] reset the last layers, or the whole network, on a fixed schedule in single-task agents; Ash and Adams [23] shrink and perturb weights. Reset &amp; Distill [5] is the closest recipe to ours: it resets actor and critic after each task and distils old experts from small stored buffers, but it is told when each task ends. Our reset is instead triggered by self-detected surprise, and old skills return only through distillation from the competence-gated memory.</w:t>
       </w:r>
     </w:p>
     <w:p>
@@ -384,6 +438,1607 @@
       <w:r>
         <w:rPr>
           <w:rFonts w:ascii="Times New Roman" w:cs="Times New Roman" w:eastAsia="Times New Roman" w:hAnsi="Times New Roman"/>
+          <w:sz w:val="20"/>
+          <w:szCs w:val="20"/>
+        </w:rPr>
+        <w:t xml:space="preserve">Table I summarises the differences. The parts we use are known; what is new is that both what to store and when to reset are decided by the agent's own success, in one fixed-size network and memory, with no task signal.</w:t>
+      </w:r>
+    </w:p>
+    <w:p>
+      <w:pPr>
+        <w:keepNext/>
+        <w:spacing w:after="0" w:before="120"/>
+        <w:jc w:val="center"/>
+      </w:pPr>
+      <w:r>
+        <w:rPr>
+          <w:rFonts w:ascii="Times New Roman" w:cs="Times New Roman" w:eastAsia="Times New Roman" w:hAnsi="Times New Roman"/>
+          <w:smallCaps/>
+          <w:sz w:val="16"/>
+          <w:szCs w:val="16"/>
+        </w:rPr>
+        <w:t xml:space="preserve">TABLE I</w:t>
+      </w:r>
+    </w:p>
+    <w:p>
+      <w:pPr>
+        <w:keepNext/>
+        <w:spacing w:after="60" w:before="0"/>
+        <w:jc w:val="center"/>
+      </w:pPr>
+      <w:r>
+        <w:rPr>
+          <w:rFonts w:ascii="Times New Roman" w:cs="Times New Roman" w:eastAsia="Times New Roman" w:hAnsi="Times New Roman"/>
+          <w:smallCaps/>
+          <w:sz w:val="16"/>
+          <w:szCs w:val="16"/>
+        </w:rPr>
+        <w:t xml:space="preserve">How our method differs from related work</w:t>
+      </w:r>
+    </w:p>
+    <w:tbl>
+      <w:tblPr>
+        <w:tblW w:type="dxa" w:w="5040"/>
+        <w:tblBorders>
+          <w:top w:val="single" w:color="auto" w:sz="4"/>
+          <w:left w:val="single" w:color="auto" w:sz="4"/>
+          <w:bottom w:val="single" w:color="auto" w:sz="4"/>
+          <w:right w:val="single" w:color="auto" w:sz="4"/>
+          <w:insideH w:val="single" w:color="auto" w:sz="4"/>
+          <w:insideV w:val="single" w:color="auto" w:sz="4"/>
+        </w:tblBorders>
+      </w:tblPr>
+      <w:tblGrid>
+        <w:gridCol w:w="1368"/>
+        <w:gridCol w:w="648"/>
+        <w:gridCol w:w="1584"/>
+        <w:gridCol w:w="1440"/>
+      </w:tblGrid>
+      <w:tr>
+        <w:trPr>
+          <w:tblHeader/>
+        </w:trPr>
+        <w:tc>
+          <w:tcPr>
+            <w:tcW w:type="dxa" w:w="1368"/>
+            <w:tcBorders>
+              <w:top w:val="single" w:color="000000" w:sz="4"/>
+              <w:left w:val="none" w:color="FFFFFF" w:sz="0"/>
+              <w:bottom w:val="single" w:color="000000" w:sz="4"/>
+              <w:right w:val="none" w:color="FFFFFF" w:sz="0"/>
+            </w:tcBorders>
+            <w:tcMar>
+              <w:top w:type="dxa" w:w="20"/>
+              <w:left w:type="dxa" w:w="50"/>
+              <w:bottom w:type="dxa" w:w="20"/>
+              <w:right w:type="dxa" w:w="50"/>
+            </w:tcMar>
+            <w:vAlign w:val="center"/>
+          </w:tcPr>
+          <w:p>
+            <w:pPr>
+              <w:spacing w:after="0" w:before="0"/>
+              <w:jc w:val="left"/>
+            </w:pPr>
+            <w:r>
+              <w:rPr>
+                <w:rFonts w:ascii="Times New Roman" w:cs="Times New Roman" w:eastAsia="Times New Roman" w:hAnsi="Times New Roman"/>
+                <w:b/>
+                <w:bCs/>
+                <w:sz w:val="15"/>
+                <w:szCs w:val="15"/>
+              </w:rPr>
+              <w:t xml:space="preserve">Method</w:t>
+            </w:r>
+          </w:p>
+        </w:tc>
+        <w:tc>
+          <w:tcPr>
+            <w:tcW w:type="dxa" w:w="648"/>
+            <w:tcBorders>
+              <w:top w:val="single" w:color="000000" w:sz="4"/>
+              <w:left w:val="none" w:color="FFFFFF" w:sz="0"/>
+              <w:bottom w:val="single" w:color="000000" w:sz="4"/>
+              <w:right w:val="none" w:color="FFFFFF" w:sz="0"/>
+            </w:tcBorders>
+            <w:tcMar>
+              <w:top w:type="dxa" w:w="20"/>
+              <w:left w:type="dxa" w:w="50"/>
+              <w:bottom w:type="dxa" w:w="20"/>
+              <w:right w:type="dxa" w:w="50"/>
+            </w:tcMar>
+            <w:vAlign w:val="center"/>
+          </w:tcPr>
+          <w:p>
+            <w:pPr>
+              <w:spacing w:after="0" w:before="0"/>
+              <w:jc w:val="center"/>
+            </w:pPr>
+            <w:r>
+              <w:rPr>
+                <w:rFonts w:ascii="Times New Roman" w:cs="Times New Roman" w:eastAsia="Times New Roman" w:hAnsi="Times New Roman"/>
+                <w:b/>
+                <w:bCs/>
+                <w:sz w:val="15"/>
+                <w:szCs w:val="15"/>
+              </w:rPr>
+              <w:t xml:space="preserve">Told task ends</w:t>
+            </w:r>
+          </w:p>
+        </w:tc>
+        <w:tc>
+          <w:tcPr>
+            <w:tcW w:type="dxa" w:w="1584"/>
+            <w:tcBorders>
+              <w:top w:val="single" w:color="000000" w:sz="4"/>
+              <w:left w:val="none" w:color="FFFFFF" w:sz="0"/>
+              <w:bottom w:val="single" w:color="000000" w:sz="4"/>
+              <w:right w:val="none" w:color="FFFFFF" w:sz="0"/>
+            </w:tcBorders>
+            <w:tcMar>
+              <w:top w:type="dxa" w:w="20"/>
+              <w:left w:type="dxa" w:w="50"/>
+              <w:bottom w:type="dxa" w:w="20"/>
+              <w:right w:type="dxa" w:w="50"/>
+            </w:tcMar>
+            <w:vAlign w:val="center"/>
+          </w:tcPr>
+          <w:p>
+            <w:pPr>
+              <w:spacing w:after="0" w:before="0"/>
+              <w:jc w:val="center"/>
+            </w:pPr>
+            <w:r>
+              <w:rPr>
+                <w:rFonts w:ascii="Times New Roman" w:cs="Times New Roman" w:eastAsia="Times New Roman" w:hAnsi="Times New Roman"/>
+                <w:b/>
+                <w:bCs/>
+                <w:sz w:val="15"/>
+                <w:szCs w:val="15"/>
+              </w:rPr>
+              <w:t xml:space="preserve">What is kept for old tasks</w:t>
+            </w:r>
+          </w:p>
+        </w:tc>
+        <w:tc>
+          <w:tcPr>
+            <w:tcW w:type="dxa" w:w="1440"/>
+            <w:tcBorders>
+              <w:top w:val="single" w:color="000000" w:sz="4"/>
+              <w:left w:val="none" w:color="FFFFFF" w:sz="0"/>
+              <w:bottom w:val="single" w:color="000000" w:sz="4"/>
+              <w:right w:val="none" w:color="FFFFFF" w:sz="0"/>
+            </w:tcBorders>
+            <w:tcMar>
+              <w:top w:type="dxa" w:w="20"/>
+              <w:left w:type="dxa" w:w="50"/>
+              <w:bottom w:type="dxa" w:w="20"/>
+              <w:right w:type="dxa" w:w="50"/>
+            </w:tcMar>
+            <w:vAlign w:val="center"/>
+          </w:tcPr>
+          <w:p>
+            <w:pPr>
+              <w:spacing w:after="0" w:before="0"/>
+              <w:jc w:val="center"/>
+            </w:pPr>
+            <w:r>
+              <w:rPr>
+                <w:rFonts w:ascii="Times New Roman" w:cs="Times New Roman" w:eastAsia="Times New Roman" w:hAnsi="Times New Roman"/>
+                <w:b/>
+                <w:bCs/>
+                <w:sz w:val="15"/>
+                <w:szCs w:val="15"/>
+              </w:rPr>
+              <w:t xml:space="preserve">Reset: trigger (scope)</w:t>
+            </w:r>
+          </w:p>
+        </w:tc>
+      </w:tr>
+      <w:tr>
+        <w:trPr>
+          <w:tblHeader w:val="off"/>
+        </w:trPr>
+        <w:tc>
+          <w:tcPr>
+            <w:tcW w:type="dxa" w:w="1368"/>
+            <w:tcBorders>
+              <w:top w:val="none" w:color="FFFFFF" w:sz="0"/>
+              <w:left w:val="none" w:color="FFFFFF" w:sz="0"/>
+              <w:bottom w:val="none" w:color="FFFFFF" w:sz="0"/>
+              <w:right w:val="none" w:color="FFFFFF" w:sz="0"/>
+            </w:tcBorders>
+            <w:tcMar>
+              <w:top w:type="dxa" w:w="20"/>
+              <w:left w:type="dxa" w:w="50"/>
+              <w:bottom w:type="dxa" w:w="20"/>
+              <w:right w:type="dxa" w:w="50"/>
+            </w:tcMar>
+            <w:vAlign w:val="center"/>
+          </w:tcPr>
+          <w:p>
+            <w:pPr>
+              <w:spacing w:after="0" w:before="0"/>
+              <w:jc w:val="left"/>
+            </w:pPr>
+            <w:r>
+              <w:rPr>
+                <w:rFonts w:ascii="Times New Roman" w:cs="Times New Roman" w:eastAsia="Times New Roman" w:hAnsi="Times New Roman"/>
+                <w:sz w:val="15"/>
+                <w:szCs w:val="15"/>
+              </w:rPr>
+              <w:t xml:space="preserve">EWC [3]</w:t>
+            </w:r>
+          </w:p>
+        </w:tc>
+        <w:tc>
+          <w:tcPr>
+            <w:tcW w:type="dxa" w:w="648"/>
+            <w:tcBorders>
+              <w:top w:val="none" w:color="FFFFFF" w:sz="0"/>
+              <w:left w:val="none" w:color="FFFFFF" w:sz="0"/>
+              <w:bottom w:val="none" w:color="FFFFFF" w:sz="0"/>
+              <w:right w:val="none" w:color="FFFFFF" w:sz="0"/>
+            </w:tcBorders>
+            <w:tcMar>
+              <w:top w:type="dxa" w:w="20"/>
+              <w:left w:type="dxa" w:w="50"/>
+              <w:bottom w:type="dxa" w:w="20"/>
+              <w:right w:type="dxa" w:w="50"/>
+            </w:tcMar>
+            <w:vAlign w:val="center"/>
+          </w:tcPr>
+          <w:p>
+            <w:pPr>
+              <w:spacing w:after="0" w:before="0"/>
+              <w:jc w:val="center"/>
+            </w:pPr>
+            <w:r>
+              <w:rPr>
+                <w:rFonts w:ascii="Times New Roman" w:cs="Times New Roman" w:eastAsia="Times New Roman" w:hAnsi="Times New Roman"/>
+                <w:sz w:val="15"/>
+                <w:szCs w:val="15"/>
+              </w:rPr>
+              <w:t xml:space="preserve">yes</w:t>
+            </w:r>
+          </w:p>
+        </w:tc>
+        <w:tc>
+          <w:tcPr>
+            <w:tcW w:type="dxa" w:w="1584"/>
+            <w:tcBorders>
+              <w:top w:val="none" w:color="FFFFFF" w:sz="0"/>
+              <w:left w:val="none" w:color="FFFFFF" w:sz="0"/>
+              <w:bottom w:val="none" w:color="FFFFFF" w:sz="0"/>
+              <w:right w:val="none" w:color="FFFFFF" w:sz="0"/>
+            </w:tcBorders>
+            <w:tcMar>
+              <w:top w:type="dxa" w:w="20"/>
+              <w:left w:type="dxa" w:w="50"/>
+              <w:bottom w:type="dxa" w:w="20"/>
+              <w:right w:type="dxa" w:w="50"/>
+            </w:tcMar>
+            <w:vAlign w:val="center"/>
+          </w:tcPr>
+          <w:p>
+            <w:pPr>
+              <w:spacing w:after="0" w:before="0"/>
+              <w:jc w:val="center"/>
+            </w:pPr>
+            <w:r>
+              <w:rPr>
+                <w:rFonts w:ascii="Times New Roman" w:cs="Times New Roman" w:eastAsia="Times New Roman" w:hAnsi="Times New Roman"/>
+                <w:sz w:val="15"/>
+                <w:szCs w:val="15"/>
+              </w:rPr>
+              <w:t xml:space="preserve">penalty on important weights</w:t>
+            </w:r>
+          </w:p>
+        </w:tc>
+        <w:tc>
+          <w:tcPr>
+            <w:tcW w:type="dxa" w:w="1440"/>
+            <w:tcBorders>
+              <w:top w:val="none" w:color="FFFFFF" w:sz="0"/>
+              <w:left w:val="none" w:color="FFFFFF" w:sz="0"/>
+              <w:bottom w:val="none" w:color="FFFFFF" w:sz="0"/>
+              <w:right w:val="none" w:color="FFFFFF" w:sz="0"/>
+            </w:tcBorders>
+            <w:tcMar>
+              <w:top w:type="dxa" w:w="20"/>
+              <w:left w:type="dxa" w:w="50"/>
+              <w:bottom w:type="dxa" w:w="20"/>
+              <w:right w:type="dxa" w:w="50"/>
+            </w:tcMar>
+            <w:vAlign w:val="center"/>
+          </w:tcPr>
+          <w:p>
+            <w:pPr>
+              <w:spacing w:after="0" w:before="0"/>
+              <w:jc w:val="center"/>
+            </w:pPr>
+            <w:r>
+              <w:rPr>
+                <w:rFonts w:ascii="Times New Roman" w:cs="Times New Roman" w:eastAsia="Times New Roman" w:hAnsi="Times New Roman"/>
+                <w:sz w:val="15"/>
+                <w:szCs w:val="15"/>
+              </w:rPr>
+              <w:t xml:space="preserve">none</w:t>
+            </w:r>
+          </w:p>
+        </w:tc>
+      </w:tr>
+      <w:tr>
+        <w:trPr>
+          <w:tblHeader w:val="off"/>
+        </w:trPr>
+        <w:tc>
+          <w:tcPr>
+            <w:tcW w:type="dxa" w:w="1368"/>
+            <w:tcBorders>
+              <w:top w:val="none" w:color="FFFFFF" w:sz="0"/>
+              <w:left w:val="none" w:color="FFFFFF" w:sz="0"/>
+              <w:bottom w:val="none" w:color="FFFFFF" w:sz="0"/>
+              <w:right w:val="none" w:color="FFFFFF" w:sz="0"/>
+            </w:tcBorders>
+            <w:tcMar>
+              <w:top w:type="dxa" w:w="20"/>
+              <w:left w:type="dxa" w:w="50"/>
+              <w:bottom w:type="dxa" w:w="20"/>
+              <w:right w:type="dxa" w:w="50"/>
+            </w:tcMar>
+            <w:vAlign w:val="center"/>
+          </w:tcPr>
+          <w:p>
+            <w:pPr>
+              <w:spacing w:after="0" w:before="0"/>
+              <w:jc w:val="left"/>
+            </w:pPr>
+            <w:r>
+              <w:rPr>
+                <w:rFonts w:ascii="Times New Roman" w:cs="Times New Roman" w:eastAsia="Times New Roman" w:hAnsi="Times New Roman"/>
+                <w:sz w:val="15"/>
+                <w:szCs w:val="15"/>
+              </w:rPr>
+              <w:t xml:space="preserve">P&amp;C [4]</w:t>
+            </w:r>
+          </w:p>
+        </w:tc>
+        <w:tc>
+          <w:tcPr>
+            <w:tcW w:type="dxa" w:w="648"/>
+            <w:tcBorders>
+              <w:top w:val="none" w:color="FFFFFF" w:sz="0"/>
+              <w:left w:val="none" w:color="FFFFFF" w:sz="0"/>
+              <w:bottom w:val="none" w:color="FFFFFF" w:sz="0"/>
+              <w:right w:val="none" w:color="FFFFFF" w:sz="0"/>
+            </w:tcBorders>
+            <w:tcMar>
+              <w:top w:type="dxa" w:w="20"/>
+              <w:left w:type="dxa" w:w="50"/>
+              <w:bottom w:type="dxa" w:w="20"/>
+              <w:right w:type="dxa" w:w="50"/>
+            </w:tcMar>
+            <w:vAlign w:val="center"/>
+          </w:tcPr>
+          <w:p>
+            <w:pPr>
+              <w:spacing w:after="0" w:before="0"/>
+              <w:jc w:val="center"/>
+            </w:pPr>
+            <w:r>
+              <w:rPr>
+                <w:rFonts w:ascii="Times New Roman" w:cs="Times New Roman" w:eastAsia="Times New Roman" w:hAnsi="Times New Roman"/>
+                <w:sz w:val="15"/>
+                <w:szCs w:val="15"/>
+              </w:rPr>
+              <w:t xml:space="preserve">yes</w:t>
+            </w:r>
+          </w:p>
+        </w:tc>
+        <w:tc>
+          <w:tcPr>
+            <w:tcW w:type="dxa" w:w="1584"/>
+            <w:tcBorders>
+              <w:top w:val="none" w:color="FFFFFF" w:sz="0"/>
+              <w:left w:val="none" w:color="FFFFFF" w:sz="0"/>
+              <w:bottom w:val="none" w:color="FFFFFF" w:sz="0"/>
+              <w:right w:val="none" w:color="FFFFFF" w:sz="0"/>
+            </w:tcBorders>
+            <w:tcMar>
+              <w:top w:type="dxa" w:w="20"/>
+              <w:left w:type="dxa" w:w="50"/>
+              <w:bottom w:type="dxa" w:w="20"/>
+              <w:right w:type="dxa" w:w="50"/>
+            </w:tcMar>
+            <w:vAlign w:val="center"/>
+          </w:tcPr>
+          <w:p>
+            <w:pPr>
+              <w:spacing w:after="0" w:before="0"/>
+              <w:jc w:val="center"/>
+            </w:pPr>
+            <w:r>
+              <w:rPr>
+                <w:rFonts w:ascii="Times New Roman" w:cs="Times New Roman" w:eastAsia="Times New Roman" w:hAnsi="Times New Roman"/>
+                <w:sz w:val="15"/>
+                <w:szCs w:val="15"/>
+              </w:rPr>
+              <w:t xml:space="preserve">distilled knowledge base</w:t>
+            </w:r>
+          </w:p>
+        </w:tc>
+        <w:tc>
+          <w:tcPr>
+            <w:tcW w:type="dxa" w:w="1440"/>
+            <w:tcBorders>
+              <w:top w:val="none" w:color="FFFFFF" w:sz="0"/>
+              <w:left w:val="none" w:color="FFFFFF" w:sz="0"/>
+              <w:bottom w:val="none" w:color="FFFFFF" w:sz="0"/>
+              <w:right w:val="none" w:color="FFFFFF" w:sz="0"/>
+            </w:tcBorders>
+            <w:tcMar>
+              <w:top w:type="dxa" w:w="20"/>
+              <w:left w:type="dxa" w:w="50"/>
+              <w:bottom w:type="dxa" w:w="20"/>
+              <w:right w:type="dxa" w:w="50"/>
+            </w:tcMar>
+            <w:vAlign w:val="center"/>
+          </w:tcPr>
+          <w:p>
+            <w:pPr>
+              <w:spacing w:after="0" w:before="0"/>
+              <w:jc w:val="center"/>
+            </w:pPr>
+            <w:r>
+              <w:rPr>
+                <w:rFonts w:ascii="Times New Roman" w:cs="Times New Roman" w:eastAsia="Times New Roman" w:hAnsi="Times New Roman"/>
+                <w:sz w:val="15"/>
+                <w:szCs w:val="15"/>
+              </w:rPr>
+              <w:t xml:space="preserve">none</w:t>
+            </w:r>
+          </w:p>
+        </w:tc>
+      </w:tr>
+      <w:tr>
+        <w:trPr>
+          <w:tblHeader w:val="off"/>
+        </w:trPr>
+        <w:tc>
+          <w:tcPr>
+            <w:tcW w:type="dxa" w:w="1368"/>
+            <w:tcBorders>
+              <w:top w:val="none" w:color="FFFFFF" w:sz="0"/>
+              <w:left w:val="none" w:color="FFFFFF" w:sz="0"/>
+              <w:bottom w:val="none" w:color="FFFFFF" w:sz="0"/>
+              <w:right w:val="none" w:color="FFFFFF" w:sz="0"/>
+            </w:tcBorders>
+            <w:tcMar>
+              <w:top w:type="dxa" w:w="20"/>
+              <w:left w:type="dxa" w:w="50"/>
+              <w:bottom w:type="dxa" w:w="20"/>
+              <w:right w:type="dxa" w:w="50"/>
+            </w:tcMar>
+            <w:vAlign w:val="center"/>
+          </w:tcPr>
+          <w:p>
+            <w:pPr>
+              <w:spacing w:after="0" w:before="0"/>
+              <w:jc w:val="left"/>
+            </w:pPr>
+            <w:r>
+              <w:rPr>
+                <w:rFonts w:ascii="Times New Roman" w:cs="Times New Roman" w:eastAsia="Times New Roman" w:hAnsi="Times New Roman"/>
+                <w:sz w:val="15"/>
+                <w:szCs w:val="15"/>
+              </w:rPr>
+              <w:t xml:space="preserve">CLEAR [11]</w:t>
+            </w:r>
+          </w:p>
+        </w:tc>
+        <w:tc>
+          <w:tcPr>
+            <w:tcW w:type="dxa" w:w="648"/>
+            <w:tcBorders>
+              <w:top w:val="none" w:color="FFFFFF" w:sz="0"/>
+              <w:left w:val="none" w:color="FFFFFF" w:sz="0"/>
+              <w:bottom w:val="none" w:color="FFFFFF" w:sz="0"/>
+              <w:right w:val="none" w:color="FFFFFF" w:sz="0"/>
+            </w:tcBorders>
+            <w:tcMar>
+              <w:top w:type="dxa" w:w="20"/>
+              <w:left w:type="dxa" w:w="50"/>
+              <w:bottom w:type="dxa" w:w="20"/>
+              <w:right w:type="dxa" w:w="50"/>
+            </w:tcMar>
+            <w:vAlign w:val="center"/>
+          </w:tcPr>
+          <w:p>
+            <w:pPr>
+              <w:spacing w:after="0" w:before="0"/>
+              <w:jc w:val="center"/>
+            </w:pPr>
+            <w:r>
+              <w:rPr>
+                <w:rFonts w:ascii="Times New Roman" w:cs="Times New Roman" w:eastAsia="Times New Roman" w:hAnsi="Times New Roman"/>
+                <w:sz w:val="15"/>
+                <w:szCs w:val="15"/>
+              </w:rPr>
+              <w:t xml:space="preserve">no</w:t>
+            </w:r>
+          </w:p>
+        </w:tc>
+        <w:tc>
+          <w:tcPr>
+            <w:tcW w:type="dxa" w:w="1584"/>
+            <w:tcBorders>
+              <w:top w:val="none" w:color="FFFFFF" w:sz="0"/>
+              <w:left w:val="none" w:color="FFFFFF" w:sz="0"/>
+              <w:bottom w:val="none" w:color="FFFFFF" w:sz="0"/>
+              <w:right w:val="none" w:color="FFFFFF" w:sz="0"/>
+            </w:tcBorders>
+            <w:tcMar>
+              <w:top w:type="dxa" w:w="20"/>
+              <w:left w:type="dxa" w:w="50"/>
+              <w:bottom w:type="dxa" w:w="20"/>
+              <w:right w:type="dxa" w:w="50"/>
+            </w:tcMar>
+            <w:vAlign w:val="center"/>
+          </w:tcPr>
+          <w:p>
+            <w:pPr>
+              <w:spacing w:after="0" w:before="0"/>
+              <w:jc w:val="center"/>
+            </w:pPr>
+            <w:r>
+              <w:rPr>
+                <w:rFonts w:ascii="Times New Roman" w:cs="Times New Roman" w:eastAsia="Times New Roman" w:hAnsi="Times New Roman"/>
+                <w:sz w:val="15"/>
+                <w:szCs w:val="15"/>
+              </w:rPr>
+              <w:t xml:space="preserve">replay of all experience</w:t>
+            </w:r>
+          </w:p>
+        </w:tc>
+        <w:tc>
+          <w:tcPr>
+            <w:tcW w:type="dxa" w:w="1440"/>
+            <w:tcBorders>
+              <w:top w:val="none" w:color="FFFFFF" w:sz="0"/>
+              <w:left w:val="none" w:color="FFFFFF" w:sz="0"/>
+              <w:bottom w:val="none" w:color="FFFFFF" w:sz="0"/>
+              <w:right w:val="none" w:color="FFFFFF" w:sz="0"/>
+            </w:tcBorders>
+            <w:tcMar>
+              <w:top w:type="dxa" w:w="20"/>
+              <w:left w:type="dxa" w:w="50"/>
+              <w:bottom w:type="dxa" w:w="20"/>
+              <w:right w:type="dxa" w:w="50"/>
+            </w:tcMar>
+            <w:vAlign w:val="center"/>
+          </w:tcPr>
+          <w:p>
+            <w:pPr>
+              <w:spacing w:after="0" w:before="0"/>
+              <w:jc w:val="center"/>
+            </w:pPr>
+            <w:r>
+              <w:rPr>
+                <w:rFonts w:ascii="Times New Roman" w:cs="Times New Roman" w:eastAsia="Times New Roman" w:hAnsi="Times New Roman"/>
+                <w:sz w:val="15"/>
+                <w:szCs w:val="15"/>
+              </w:rPr>
+              <w:t xml:space="preserve">none</w:t>
+            </w:r>
+          </w:p>
+        </w:tc>
+      </w:tr>
+      <w:tr>
+        <w:trPr>
+          <w:tblHeader w:val="off"/>
+        </w:trPr>
+        <w:tc>
+          <w:tcPr>
+            <w:tcW w:type="dxa" w:w="1368"/>
+            <w:tcBorders>
+              <w:top w:val="none" w:color="FFFFFF" w:sz="0"/>
+              <w:left w:val="none" w:color="FFFFFF" w:sz="0"/>
+              <w:bottom w:val="none" w:color="FFFFFF" w:sz="0"/>
+              <w:right w:val="none" w:color="FFFFFF" w:sz="0"/>
+            </w:tcBorders>
+            <w:tcMar>
+              <w:top w:type="dxa" w:w="20"/>
+              <w:left w:type="dxa" w:w="50"/>
+              <w:bottom w:type="dxa" w:w="20"/>
+              <w:right w:type="dxa" w:w="50"/>
+            </w:tcMar>
+            <w:vAlign w:val="center"/>
+          </w:tcPr>
+          <w:p>
+            <w:pPr>
+              <w:spacing w:after="0" w:before="0"/>
+              <w:jc w:val="left"/>
+            </w:pPr>
+            <w:r>
+              <w:rPr>
+                <w:rFonts w:ascii="Times New Roman" w:cs="Times New Roman" w:eastAsia="Times New Roman" w:hAnsi="Times New Roman"/>
+                <w:sz w:val="15"/>
+                <w:szCs w:val="15"/>
+              </w:rPr>
+              <w:t xml:space="preserve">Task-free CL [6]</w:t>
+            </w:r>
+          </w:p>
+        </w:tc>
+        <w:tc>
+          <w:tcPr>
+            <w:tcW w:type="dxa" w:w="648"/>
+            <w:tcBorders>
+              <w:top w:val="none" w:color="FFFFFF" w:sz="0"/>
+              <w:left w:val="none" w:color="FFFFFF" w:sz="0"/>
+              <w:bottom w:val="none" w:color="FFFFFF" w:sz="0"/>
+              <w:right w:val="none" w:color="FFFFFF" w:sz="0"/>
+            </w:tcBorders>
+            <w:tcMar>
+              <w:top w:type="dxa" w:w="20"/>
+              <w:left w:type="dxa" w:w="50"/>
+              <w:bottom w:type="dxa" w:w="20"/>
+              <w:right w:type="dxa" w:w="50"/>
+            </w:tcMar>
+            <w:vAlign w:val="center"/>
+          </w:tcPr>
+          <w:p>
+            <w:pPr>
+              <w:spacing w:after="0" w:before="0"/>
+              <w:jc w:val="center"/>
+            </w:pPr>
+            <w:r>
+              <w:rPr>
+                <w:rFonts w:ascii="Times New Roman" w:cs="Times New Roman" w:eastAsia="Times New Roman" w:hAnsi="Times New Roman"/>
+                <w:sz w:val="15"/>
+                <w:szCs w:val="15"/>
+              </w:rPr>
+              <w:t xml:space="preserve">no</w:t>
+            </w:r>
+          </w:p>
+        </w:tc>
+        <w:tc>
+          <w:tcPr>
+            <w:tcW w:type="dxa" w:w="1584"/>
+            <w:tcBorders>
+              <w:top w:val="none" w:color="FFFFFF" w:sz="0"/>
+              <w:left w:val="none" w:color="FFFFFF" w:sz="0"/>
+              <w:bottom w:val="none" w:color="FFFFFF" w:sz="0"/>
+              <w:right w:val="none" w:color="FFFFFF" w:sz="0"/>
+            </w:tcBorders>
+            <w:tcMar>
+              <w:top w:type="dxa" w:w="20"/>
+              <w:left w:type="dxa" w:w="50"/>
+              <w:bottom w:type="dxa" w:w="20"/>
+              <w:right w:type="dxa" w:w="50"/>
+            </w:tcMar>
+            <w:vAlign w:val="center"/>
+          </w:tcPr>
+          <w:p>
+            <w:pPr>
+              <w:spacing w:after="0" w:before="0"/>
+              <w:jc w:val="center"/>
+            </w:pPr>
+            <w:r>
+              <w:rPr>
+                <w:rFonts w:ascii="Times New Roman" w:cs="Times New Roman" w:eastAsia="Times New Roman" w:hAnsi="Times New Roman"/>
+                <w:sz w:val="15"/>
+                <w:szCs w:val="15"/>
+              </w:rPr>
+              <w:t xml:space="preserve">weights fixed at loss plateaus, small buffer</w:t>
+            </w:r>
+          </w:p>
+        </w:tc>
+        <w:tc>
+          <w:tcPr>
+            <w:tcW w:type="dxa" w:w="1440"/>
+            <w:tcBorders>
+              <w:top w:val="none" w:color="FFFFFF" w:sz="0"/>
+              <w:left w:val="none" w:color="FFFFFF" w:sz="0"/>
+              <w:bottom w:val="none" w:color="FFFFFF" w:sz="0"/>
+              <w:right w:val="none" w:color="FFFFFF" w:sz="0"/>
+            </w:tcBorders>
+            <w:tcMar>
+              <w:top w:type="dxa" w:w="20"/>
+              <w:left w:type="dxa" w:w="50"/>
+              <w:bottom w:type="dxa" w:w="20"/>
+              <w:right w:type="dxa" w:w="50"/>
+            </w:tcMar>
+            <w:vAlign w:val="center"/>
+          </w:tcPr>
+          <w:p>
+            <w:pPr>
+              <w:spacing w:after="0" w:before="0"/>
+              <w:jc w:val="center"/>
+            </w:pPr>
+            <w:r>
+              <w:rPr>
+                <w:rFonts w:ascii="Times New Roman" w:cs="Times New Roman" w:eastAsia="Times New Roman" w:hAnsi="Times New Roman"/>
+                <w:sz w:val="15"/>
+                <w:szCs w:val="15"/>
+              </w:rPr>
+              <w:t xml:space="preserve">none</w:t>
+            </w:r>
+          </w:p>
+        </w:tc>
+      </w:tr>
+      <w:tr>
+        <w:trPr>
+          <w:tblHeader w:val="off"/>
+        </w:trPr>
+        <w:tc>
+          <w:tcPr>
+            <w:tcW w:type="dxa" w:w="1368"/>
+            <w:tcBorders>
+              <w:top w:val="none" w:color="FFFFFF" w:sz="0"/>
+              <w:left w:val="none" w:color="FFFFFF" w:sz="0"/>
+              <w:bottom w:val="none" w:color="FFFFFF" w:sz="0"/>
+              <w:right w:val="none" w:color="FFFFFF" w:sz="0"/>
+            </w:tcBorders>
+            <w:tcMar>
+              <w:top w:type="dxa" w:w="20"/>
+              <w:left w:type="dxa" w:w="50"/>
+              <w:bottom w:type="dxa" w:w="20"/>
+              <w:right w:type="dxa" w:w="50"/>
+            </w:tcMar>
+            <w:vAlign w:val="center"/>
+          </w:tcPr>
+          <w:p>
+            <w:pPr>
+              <w:spacing w:after="0" w:before="0"/>
+              <w:jc w:val="left"/>
+            </w:pPr>
+            <w:r>
+              <w:rPr>
+                <w:rFonts w:ascii="Times New Roman" w:cs="Times New Roman" w:eastAsia="Times New Roman" w:hAnsi="Times New Roman"/>
+                <w:sz w:val="15"/>
+                <w:szCs w:val="15"/>
+              </w:rPr>
+              <w:t xml:space="preserve">3RL [9]</w:t>
+            </w:r>
+          </w:p>
+        </w:tc>
+        <w:tc>
+          <w:tcPr>
+            <w:tcW w:type="dxa" w:w="648"/>
+            <w:tcBorders>
+              <w:top w:val="none" w:color="FFFFFF" w:sz="0"/>
+              <w:left w:val="none" w:color="FFFFFF" w:sz="0"/>
+              <w:bottom w:val="none" w:color="FFFFFF" w:sz="0"/>
+              <w:right w:val="none" w:color="FFFFFF" w:sz="0"/>
+            </w:tcBorders>
+            <w:tcMar>
+              <w:top w:type="dxa" w:w="20"/>
+              <w:left w:type="dxa" w:w="50"/>
+              <w:bottom w:type="dxa" w:w="20"/>
+              <w:right w:type="dxa" w:w="50"/>
+            </w:tcMar>
+            <w:vAlign w:val="center"/>
+          </w:tcPr>
+          <w:p>
+            <w:pPr>
+              <w:spacing w:after="0" w:before="0"/>
+              <w:jc w:val="center"/>
+            </w:pPr>
+            <w:r>
+              <w:rPr>
+                <w:rFonts w:ascii="Times New Roman" w:cs="Times New Roman" w:eastAsia="Times New Roman" w:hAnsi="Times New Roman"/>
+                <w:sz w:val="15"/>
+                <w:szCs w:val="15"/>
+              </w:rPr>
+              <w:t xml:space="preserve">no</w:t>
+            </w:r>
+          </w:p>
+        </w:tc>
+        <w:tc>
+          <w:tcPr>
+            <w:tcW w:type="dxa" w:w="1584"/>
+            <w:tcBorders>
+              <w:top w:val="none" w:color="FFFFFF" w:sz="0"/>
+              <w:left w:val="none" w:color="FFFFFF" w:sz="0"/>
+              <w:bottom w:val="none" w:color="FFFFFF" w:sz="0"/>
+              <w:right w:val="none" w:color="FFFFFF" w:sz="0"/>
+            </w:tcBorders>
+            <w:tcMar>
+              <w:top w:type="dxa" w:w="20"/>
+              <w:left w:type="dxa" w:w="50"/>
+              <w:bottom w:type="dxa" w:w="20"/>
+              <w:right w:type="dxa" w:w="50"/>
+            </w:tcMar>
+            <w:vAlign w:val="center"/>
+          </w:tcPr>
+          <w:p>
+            <w:pPr>
+              <w:spacing w:after="0" w:before="0"/>
+              <w:jc w:val="center"/>
+            </w:pPr>
+            <w:r>
+              <w:rPr>
+                <w:rFonts w:ascii="Times New Roman" w:cs="Times New Roman" w:eastAsia="Times New Roman" w:hAnsi="Times New Roman"/>
+                <w:sz w:val="15"/>
+                <w:szCs w:val="15"/>
+              </w:rPr>
+              <w:t xml:space="preserve">replay + recurrent task context</w:t>
+            </w:r>
+          </w:p>
+        </w:tc>
+        <w:tc>
+          <w:tcPr>
+            <w:tcW w:type="dxa" w:w="1440"/>
+            <w:tcBorders>
+              <w:top w:val="none" w:color="FFFFFF" w:sz="0"/>
+              <w:left w:val="none" w:color="FFFFFF" w:sz="0"/>
+              <w:bottom w:val="none" w:color="FFFFFF" w:sz="0"/>
+              <w:right w:val="none" w:color="FFFFFF" w:sz="0"/>
+            </w:tcBorders>
+            <w:tcMar>
+              <w:top w:type="dxa" w:w="20"/>
+              <w:left w:type="dxa" w:w="50"/>
+              <w:bottom w:type="dxa" w:w="20"/>
+              <w:right w:type="dxa" w:w="50"/>
+            </w:tcMar>
+            <w:vAlign w:val="center"/>
+          </w:tcPr>
+          <w:p>
+            <w:pPr>
+              <w:spacing w:after="0" w:before="0"/>
+              <w:jc w:val="center"/>
+            </w:pPr>
+            <w:r>
+              <w:rPr>
+                <w:rFonts w:ascii="Times New Roman" w:cs="Times New Roman" w:eastAsia="Times New Roman" w:hAnsi="Times New Roman"/>
+                <w:sz w:val="15"/>
+                <w:szCs w:val="15"/>
+              </w:rPr>
+              <w:t xml:space="preserve">none</w:t>
+            </w:r>
+          </w:p>
+        </w:tc>
+      </w:tr>
+      <w:tr>
+        <w:trPr>
+          <w:tblHeader w:val="off"/>
+        </w:trPr>
+        <w:tc>
+          <w:tcPr>
+            <w:tcW w:type="dxa" w:w="1368"/>
+            <w:tcBorders>
+              <w:top w:val="none" w:color="FFFFFF" w:sz="0"/>
+              <w:left w:val="none" w:color="FFFFFF" w:sz="0"/>
+              <w:bottom w:val="none" w:color="FFFFFF" w:sz="0"/>
+              <w:right w:val="none" w:color="FFFFFF" w:sz="0"/>
+            </w:tcBorders>
+            <w:tcMar>
+              <w:top w:type="dxa" w:w="20"/>
+              <w:left w:type="dxa" w:w="50"/>
+              <w:bottom w:type="dxa" w:w="20"/>
+              <w:right w:type="dxa" w:w="50"/>
+            </w:tcMar>
+            <w:vAlign w:val="center"/>
+          </w:tcPr>
+          <w:p>
+            <w:pPr>
+              <w:spacing w:after="0" w:before="0"/>
+              <w:jc w:val="left"/>
+            </w:pPr>
+            <w:r>
+              <w:rPr>
+                <w:rFonts w:ascii="Times New Roman" w:cs="Times New Roman" w:eastAsia="Times New Roman" w:hAnsi="Times New Roman"/>
+                <w:sz w:val="15"/>
+                <w:szCs w:val="15"/>
+              </w:rPr>
+              <w:t xml:space="preserve">Dick et al. [10]</w:t>
+            </w:r>
+          </w:p>
+        </w:tc>
+        <w:tc>
+          <w:tcPr>
+            <w:tcW w:type="dxa" w:w="648"/>
+            <w:tcBorders>
+              <w:top w:val="none" w:color="FFFFFF" w:sz="0"/>
+              <w:left w:val="none" w:color="FFFFFF" w:sz="0"/>
+              <w:bottom w:val="none" w:color="FFFFFF" w:sz="0"/>
+              <w:right w:val="none" w:color="FFFFFF" w:sz="0"/>
+            </w:tcBorders>
+            <w:tcMar>
+              <w:top w:type="dxa" w:w="20"/>
+              <w:left w:type="dxa" w:w="50"/>
+              <w:bottom w:type="dxa" w:w="20"/>
+              <w:right w:type="dxa" w:w="50"/>
+            </w:tcMar>
+            <w:vAlign w:val="center"/>
+          </w:tcPr>
+          <w:p>
+            <w:pPr>
+              <w:spacing w:after="0" w:before="0"/>
+              <w:jc w:val="center"/>
+            </w:pPr>
+            <w:r>
+              <w:rPr>
+                <w:rFonts w:ascii="Times New Roman" w:cs="Times New Roman" w:eastAsia="Times New Roman" w:hAnsi="Times New Roman"/>
+                <w:sz w:val="15"/>
+                <w:szCs w:val="15"/>
+              </w:rPr>
+              <w:t xml:space="preserve">no (tests)</w:t>
+            </w:r>
+          </w:p>
+        </w:tc>
+        <w:tc>
+          <w:tcPr>
+            <w:tcW w:type="dxa" w:w="1584"/>
+            <w:tcBorders>
+              <w:top w:val="none" w:color="FFFFFF" w:sz="0"/>
+              <w:left w:val="none" w:color="FFFFFF" w:sz="0"/>
+              <w:bottom w:val="none" w:color="FFFFFF" w:sz="0"/>
+              <w:right w:val="none" w:color="FFFFFF" w:sz="0"/>
+            </w:tcBorders>
+            <w:tcMar>
+              <w:top w:type="dxa" w:w="20"/>
+              <w:left w:type="dxa" w:w="50"/>
+              <w:bottom w:type="dxa" w:w="20"/>
+              <w:right w:type="dxa" w:w="50"/>
+            </w:tcMar>
+            <w:vAlign w:val="center"/>
+          </w:tcPr>
+          <w:p>
+            <w:pPr>
+              <w:spacing w:after="0" w:before="0"/>
+              <w:jc w:val="center"/>
+            </w:pPr>
+            <w:r>
+              <w:rPr>
+                <w:rFonts w:ascii="Times New Roman" w:cs="Times New Roman" w:eastAsia="Times New Roman" w:hAnsi="Times New Roman"/>
+                <w:sz w:val="15"/>
+                <w:szCs w:val="15"/>
+              </w:rPr>
+              <w:t xml:space="preserve">one policy per detected context</w:t>
+            </w:r>
+          </w:p>
+        </w:tc>
+        <w:tc>
+          <w:tcPr>
+            <w:tcW w:type="dxa" w:w="1440"/>
+            <w:tcBorders>
+              <w:top w:val="none" w:color="FFFFFF" w:sz="0"/>
+              <w:left w:val="none" w:color="FFFFFF" w:sz="0"/>
+              <w:bottom w:val="none" w:color="FFFFFF" w:sz="0"/>
+              <w:right w:val="none" w:color="FFFFFF" w:sz="0"/>
+            </w:tcBorders>
+            <w:tcMar>
+              <w:top w:type="dxa" w:w="20"/>
+              <w:left w:type="dxa" w:w="50"/>
+              <w:bottom w:type="dxa" w:w="20"/>
+              <w:right w:type="dxa" w:w="50"/>
+            </w:tcMar>
+            <w:vAlign w:val="center"/>
+          </w:tcPr>
+          <w:p>
+            <w:pPr>
+              <w:spacing w:after="0" w:before="0"/>
+              <w:jc w:val="center"/>
+            </w:pPr>
+            <w:r>
+              <w:rPr>
+                <w:rFonts w:ascii="Times New Roman" w:cs="Times New Roman" w:eastAsia="Times New Roman" w:hAnsi="Times New Roman"/>
+                <w:sz w:val="15"/>
+                <w:szCs w:val="15"/>
+              </w:rPr>
+              <w:t xml:space="preserve">new policy per context</w:t>
+            </w:r>
+          </w:p>
+        </w:tc>
+      </w:tr>
+      <w:tr>
+        <w:trPr>
+          <w:tblHeader w:val="off"/>
+        </w:trPr>
+        <w:tc>
+          <w:tcPr>
+            <w:tcW w:type="dxa" w:w="1368"/>
+            <w:tcBorders>
+              <w:top w:val="none" w:color="FFFFFF" w:sz="0"/>
+              <w:left w:val="none" w:color="FFFFFF" w:sz="0"/>
+              <w:bottom w:val="none" w:color="FFFFFF" w:sz="0"/>
+              <w:right w:val="none" w:color="FFFFFF" w:sz="0"/>
+            </w:tcBorders>
+            <w:tcMar>
+              <w:top w:type="dxa" w:w="20"/>
+              <w:left w:type="dxa" w:w="50"/>
+              <w:bottom w:type="dxa" w:w="20"/>
+              <w:right w:type="dxa" w:w="50"/>
+            </w:tcMar>
+            <w:vAlign w:val="center"/>
+          </w:tcPr>
+          <w:p>
+            <w:pPr>
+              <w:spacing w:after="0" w:before="0"/>
+              <w:jc w:val="left"/>
+            </w:pPr>
+            <w:r>
+              <w:rPr>
+                <w:rFonts w:ascii="Times New Roman" w:cs="Times New Roman" w:eastAsia="Times New Roman" w:hAnsi="Times New Roman"/>
+                <w:sz w:val="15"/>
+                <w:szCs w:val="15"/>
+              </w:rPr>
+              <w:t xml:space="preserve">Primacy bias [16]</w:t>
+            </w:r>
+          </w:p>
+        </w:tc>
+        <w:tc>
+          <w:tcPr>
+            <w:tcW w:type="dxa" w:w="648"/>
+            <w:tcBorders>
+              <w:top w:val="none" w:color="FFFFFF" w:sz="0"/>
+              <w:left w:val="none" w:color="FFFFFF" w:sz="0"/>
+              <w:bottom w:val="none" w:color="FFFFFF" w:sz="0"/>
+              <w:right w:val="none" w:color="FFFFFF" w:sz="0"/>
+            </w:tcBorders>
+            <w:tcMar>
+              <w:top w:type="dxa" w:w="20"/>
+              <w:left w:type="dxa" w:w="50"/>
+              <w:bottom w:type="dxa" w:w="20"/>
+              <w:right w:type="dxa" w:w="50"/>
+            </w:tcMar>
+            <w:vAlign w:val="center"/>
+          </w:tcPr>
+          <w:p>
+            <w:pPr>
+              <w:spacing w:after="0" w:before="0"/>
+              <w:jc w:val="center"/>
+            </w:pPr>
+            <w:r>
+              <w:rPr>
+                <w:rFonts w:ascii="Times New Roman" w:cs="Times New Roman" w:eastAsia="Times New Roman" w:hAnsi="Times New Roman"/>
+                <w:sz w:val="15"/>
+                <w:szCs w:val="15"/>
+              </w:rPr>
+              <w:t xml:space="preserve">single task</w:t>
+            </w:r>
+          </w:p>
+        </w:tc>
+        <w:tc>
+          <w:tcPr>
+            <w:tcW w:type="dxa" w:w="1584"/>
+            <w:tcBorders>
+              <w:top w:val="none" w:color="FFFFFF" w:sz="0"/>
+              <w:left w:val="none" w:color="FFFFFF" w:sz="0"/>
+              <w:bottom w:val="none" w:color="FFFFFF" w:sz="0"/>
+              <w:right w:val="none" w:color="FFFFFF" w:sz="0"/>
+            </w:tcBorders>
+            <w:tcMar>
+              <w:top w:type="dxa" w:w="20"/>
+              <w:left w:type="dxa" w:w="50"/>
+              <w:bottom w:type="dxa" w:w="20"/>
+              <w:right w:type="dxa" w:w="50"/>
+            </w:tcMar>
+            <w:vAlign w:val="center"/>
+          </w:tcPr>
+          <w:p>
+            <w:pPr>
+              <w:spacing w:after="0" w:before="0"/>
+              <w:jc w:val="center"/>
+            </w:pPr>
+            <w:r>
+              <w:rPr>
+                <w:rFonts w:ascii="Times New Roman" w:cs="Times New Roman" w:eastAsia="Times New Roman" w:hAnsi="Times New Roman"/>
+                <w:sz w:val="15"/>
+                <w:szCs w:val="15"/>
+              </w:rPr>
+              <w:t xml:space="preserve">replay buffer</w:t>
+            </w:r>
+          </w:p>
+        </w:tc>
+        <w:tc>
+          <w:tcPr>
+            <w:tcW w:type="dxa" w:w="1440"/>
+            <w:tcBorders>
+              <w:top w:val="none" w:color="FFFFFF" w:sz="0"/>
+              <w:left w:val="none" w:color="FFFFFF" w:sz="0"/>
+              <w:bottom w:val="none" w:color="FFFFFF" w:sz="0"/>
+              <w:right w:val="none" w:color="FFFFFF" w:sz="0"/>
+            </w:tcBorders>
+            <w:tcMar>
+              <w:top w:type="dxa" w:w="20"/>
+              <w:left w:type="dxa" w:w="50"/>
+              <w:bottom w:type="dxa" w:w="20"/>
+              <w:right w:type="dxa" w:w="50"/>
+            </w:tcMar>
+            <w:vAlign w:val="center"/>
+          </w:tcPr>
+          <w:p>
+            <w:pPr>
+              <w:spacing w:after="0" w:before="0"/>
+              <w:jc w:val="center"/>
+            </w:pPr>
+            <w:r>
+              <w:rPr>
+                <w:rFonts w:ascii="Times New Roman" w:cs="Times New Roman" w:eastAsia="Times New Roman" w:hAnsi="Times New Roman"/>
+                <w:sz w:val="15"/>
+                <w:szCs w:val="15"/>
+              </w:rPr>
+              <w:t xml:space="preserve">fixed schedule (last layers or all)</w:t>
+            </w:r>
+          </w:p>
+        </w:tc>
+      </w:tr>
+      <w:tr>
+        <w:trPr>
+          <w:tblHeader w:val="off"/>
+        </w:trPr>
+        <w:tc>
+          <w:tcPr>
+            <w:tcW w:type="dxa" w:w="1368"/>
+            <w:tcBorders>
+              <w:top w:val="none" w:color="FFFFFF" w:sz="0"/>
+              <w:left w:val="none" w:color="FFFFFF" w:sz="0"/>
+              <w:bottom w:val="none" w:color="FFFFFF" w:sz="0"/>
+              <w:right w:val="none" w:color="FFFFFF" w:sz="0"/>
+            </w:tcBorders>
+            <w:tcMar>
+              <w:top w:type="dxa" w:w="20"/>
+              <w:left w:type="dxa" w:w="50"/>
+              <w:bottom w:type="dxa" w:w="20"/>
+              <w:right w:type="dxa" w:w="50"/>
+            </w:tcMar>
+            <w:vAlign w:val="center"/>
+          </w:tcPr>
+          <w:p>
+            <w:pPr>
+              <w:spacing w:after="0" w:before="0"/>
+              <w:jc w:val="left"/>
+            </w:pPr>
+            <w:r>
+              <w:rPr>
+                <w:rFonts w:ascii="Times New Roman" w:cs="Times New Roman" w:eastAsia="Times New Roman" w:hAnsi="Times New Roman"/>
+                <w:sz w:val="15"/>
+                <w:szCs w:val="15"/>
+              </w:rPr>
+              <w:t xml:space="preserve">ReDo [15]</w:t>
+            </w:r>
+          </w:p>
+        </w:tc>
+        <w:tc>
+          <w:tcPr>
+            <w:tcW w:type="dxa" w:w="648"/>
+            <w:tcBorders>
+              <w:top w:val="none" w:color="FFFFFF" w:sz="0"/>
+              <w:left w:val="none" w:color="FFFFFF" w:sz="0"/>
+              <w:bottom w:val="none" w:color="FFFFFF" w:sz="0"/>
+              <w:right w:val="none" w:color="FFFFFF" w:sz="0"/>
+            </w:tcBorders>
+            <w:tcMar>
+              <w:top w:type="dxa" w:w="20"/>
+              <w:left w:type="dxa" w:w="50"/>
+              <w:bottom w:type="dxa" w:w="20"/>
+              <w:right w:type="dxa" w:w="50"/>
+            </w:tcMar>
+            <w:vAlign w:val="center"/>
+          </w:tcPr>
+          <w:p>
+            <w:pPr>
+              <w:spacing w:after="0" w:before="0"/>
+              <w:jc w:val="center"/>
+            </w:pPr>
+            <w:r>
+              <w:rPr>
+                <w:rFonts w:ascii="Times New Roman" w:cs="Times New Roman" w:eastAsia="Times New Roman" w:hAnsi="Times New Roman"/>
+                <w:sz w:val="15"/>
+                <w:szCs w:val="15"/>
+              </w:rPr>
+              <w:t xml:space="preserve">single task</w:t>
+            </w:r>
+          </w:p>
+        </w:tc>
+        <w:tc>
+          <w:tcPr>
+            <w:tcW w:type="dxa" w:w="1584"/>
+            <w:tcBorders>
+              <w:top w:val="none" w:color="FFFFFF" w:sz="0"/>
+              <w:left w:val="none" w:color="FFFFFF" w:sz="0"/>
+              <w:bottom w:val="none" w:color="FFFFFF" w:sz="0"/>
+              <w:right w:val="none" w:color="FFFFFF" w:sz="0"/>
+            </w:tcBorders>
+            <w:tcMar>
+              <w:top w:type="dxa" w:w="20"/>
+              <w:left w:type="dxa" w:w="50"/>
+              <w:bottom w:type="dxa" w:w="20"/>
+              <w:right w:type="dxa" w:w="50"/>
+            </w:tcMar>
+            <w:vAlign w:val="center"/>
+          </w:tcPr>
+          <w:p>
+            <w:pPr>
+              <w:spacing w:after="0" w:before="0"/>
+              <w:jc w:val="center"/>
+            </w:pPr>
+            <w:r>
+              <w:rPr>
+                <w:rFonts w:ascii="Times New Roman" w:cs="Times New Roman" w:eastAsia="Times New Roman" w:hAnsi="Times New Roman"/>
+                <w:sz w:val="15"/>
+                <w:szCs w:val="15"/>
+              </w:rPr>
+              <w:t xml:space="preserve">–</w:t>
+            </w:r>
+          </w:p>
+        </w:tc>
+        <w:tc>
+          <w:tcPr>
+            <w:tcW w:type="dxa" w:w="1440"/>
+            <w:tcBorders>
+              <w:top w:val="none" w:color="FFFFFF" w:sz="0"/>
+              <w:left w:val="none" w:color="FFFFFF" w:sz="0"/>
+              <w:bottom w:val="none" w:color="FFFFFF" w:sz="0"/>
+              <w:right w:val="none" w:color="FFFFFF" w:sz="0"/>
+            </w:tcBorders>
+            <w:tcMar>
+              <w:top w:type="dxa" w:w="20"/>
+              <w:left w:type="dxa" w:w="50"/>
+              <w:bottom w:type="dxa" w:w="20"/>
+              <w:right w:type="dxa" w:w="50"/>
+            </w:tcMar>
+            <w:vAlign w:val="center"/>
+          </w:tcPr>
+          <w:p>
+            <w:pPr>
+              <w:spacing w:after="0" w:before="0"/>
+              <w:jc w:val="center"/>
+            </w:pPr>
+            <w:r>
+              <w:rPr>
+                <w:rFonts w:ascii="Times New Roman" w:cs="Times New Roman" w:eastAsia="Times New Roman" w:hAnsi="Times New Roman"/>
+                <w:sz w:val="15"/>
+                <w:szCs w:val="15"/>
+              </w:rPr>
+              <w:t xml:space="preserve">periodic (dormant units)</w:t>
+            </w:r>
+          </w:p>
+        </w:tc>
+      </w:tr>
+      <w:tr>
+        <w:trPr>
+          <w:tblHeader w:val="off"/>
+        </w:trPr>
+        <w:tc>
+          <w:tcPr>
+            <w:tcW w:type="dxa" w:w="1368"/>
+            <w:tcBorders>
+              <w:top w:val="none" w:color="FFFFFF" w:sz="0"/>
+              <w:left w:val="none" w:color="FFFFFF" w:sz="0"/>
+              <w:bottom w:val="none" w:color="FFFFFF" w:sz="0"/>
+              <w:right w:val="none" w:color="FFFFFF" w:sz="0"/>
+            </w:tcBorders>
+            <w:tcMar>
+              <w:top w:type="dxa" w:w="20"/>
+              <w:left w:type="dxa" w:w="50"/>
+              <w:bottom w:type="dxa" w:w="20"/>
+              <w:right w:type="dxa" w:w="50"/>
+            </w:tcMar>
+            <w:vAlign w:val="center"/>
+          </w:tcPr>
+          <w:p>
+            <w:pPr>
+              <w:spacing w:after="0" w:before="0"/>
+              <w:jc w:val="left"/>
+            </w:pPr>
+            <w:r>
+              <w:rPr>
+                <w:rFonts w:ascii="Times New Roman" w:cs="Times New Roman" w:eastAsia="Times New Roman" w:hAnsi="Times New Roman"/>
+                <w:sz w:val="15"/>
+                <w:szCs w:val="15"/>
+              </w:rPr>
+              <w:t xml:space="preserve">Reset &amp; Distill [5]</w:t>
+            </w:r>
+          </w:p>
+        </w:tc>
+        <w:tc>
+          <w:tcPr>
+            <w:tcW w:type="dxa" w:w="648"/>
+            <w:tcBorders>
+              <w:top w:val="none" w:color="FFFFFF" w:sz="0"/>
+              <w:left w:val="none" w:color="FFFFFF" w:sz="0"/>
+              <w:bottom w:val="none" w:color="FFFFFF" w:sz="0"/>
+              <w:right w:val="none" w:color="FFFFFF" w:sz="0"/>
+            </w:tcBorders>
+            <w:tcMar>
+              <w:top w:type="dxa" w:w="20"/>
+              <w:left w:type="dxa" w:w="50"/>
+              <w:bottom w:type="dxa" w:w="20"/>
+              <w:right w:type="dxa" w:w="50"/>
+            </w:tcMar>
+            <w:vAlign w:val="center"/>
+          </w:tcPr>
+          <w:p>
+            <w:pPr>
+              <w:spacing w:after="0" w:before="0"/>
+              <w:jc w:val="center"/>
+            </w:pPr>
+            <w:r>
+              <w:rPr>
+                <w:rFonts w:ascii="Times New Roman" w:cs="Times New Roman" w:eastAsia="Times New Roman" w:hAnsi="Times New Roman"/>
+                <w:sz w:val="15"/>
+                <w:szCs w:val="15"/>
+              </w:rPr>
+              <w:t xml:space="preserve">yes</w:t>
+            </w:r>
+          </w:p>
+        </w:tc>
+        <w:tc>
+          <w:tcPr>
+            <w:tcW w:type="dxa" w:w="1584"/>
+            <w:tcBorders>
+              <w:top w:val="none" w:color="FFFFFF" w:sz="0"/>
+              <w:left w:val="none" w:color="FFFFFF" w:sz="0"/>
+              <w:bottom w:val="none" w:color="FFFFFF" w:sz="0"/>
+              <w:right w:val="none" w:color="FFFFFF" w:sz="0"/>
+            </w:tcBorders>
+            <w:tcMar>
+              <w:top w:type="dxa" w:w="20"/>
+              <w:left w:type="dxa" w:w="50"/>
+              <w:bottom w:type="dxa" w:w="20"/>
+              <w:right w:type="dxa" w:w="50"/>
+            </w:tcMar>
+            <w:vAlign w:val="center"/>
+          </w:tcPr>
+          <w:p>
+            <w:pPr>
+              <w:spacing w:after="0" w:before="0"/>
+              <w:jc w:val="center"/>
+            </w:pPr>
+            <w:r>
+              <w:rPr>
+                <w:rFonts w:ascii="Times New Roman" w:cs="Times New Roman" w:eastAsia="Times New Roman" w:hAnsi="Times New Roman"/>
+                <w:sz w:val="15"/>
+                <w:szCs w:val="15"/>
+              </w:rPr>
+              <w:t xml:space="preserve">small per-task buffers, distilled</w:t>
+            </w:r>
+          </w:p>
+        </w:tc>
+        <w:tc>
+          <w:tcPr>
+            <w:tcW w:type="dxa" w:w="1440"/>
+            <w:tcBorders>
+              <w:top w:val="none" w:color="FFFFFF" w:sz="0"/>
+              <w:left w:val="none" w:color="FFFFFF" w:sz="0"/>
+              <w:bottom w:val="none" w:color="FFFFFF" w:sz="0"/>
+              <w:right w:val="none" w:color="FFFFFF" w:sz="0"/>
+            </w:tcBorders>
+            <w:tcMar>
+              <w:top w:type="dxa" w:w="20"/>
+              <w:left w:type="dxa" w:w="50"/>
+              <w:bottom w:type="dxa" w:w="20"/>
+              <w:right w:type="dxa" w:w="50"/>
+            </w:tcMar>
+            <w:vAlign w:val="center"/>
+          </w:tcPr>
+          <w:p>
+            <w:pPr>
+              <w:spacing w:after="0" w:before="0"/>
+              <w:jc w:val="center"/>
+            </w:pPr>
+            <w:r>
+              <w:rPr>
+                <w:rFonts w:ascii="Times New Roman" w:cs="Times New Roman" w:eastAsia="Times New Roman" w:hAnsi="Times New Roman"/>
+                <w:sz w:val="15"/>
+                <w:szCs w:val="15"/>
+              </w:rPr>
+              <w:t xml:space="preserve">every given task end (actor, critic)</w:t>
+            </w:r>
+          </w:p>
+        </w:tc>
+      </w:tr>
+      <w:tr>
+        <w:trPr>
+          <w:tblHeader w:val="off"/>
+        </w:trPr>
+        <w:tc>
+          <w:tcPr>
+            <w:tcW w:type="dxa" w:w="1368"/>
+            <w:tcBorders>
+              <w:top w:val="none" w:color="FFFFFF" w:sz="0"/>
+              <w:left w:val="none" w:color="FFFFFF" w:sz="0"/>
+              <w:bottom w:val="single" w:color="000000" w:sz="4"/>
+              <w:right w:val="none" w:color="FFFFFF" w:sz="0"/>
+            </w:tcBorders>
+            <w:tcMar>
+              <w:top w:type="dxa" w:w="20"/>
+              <w:left w:type="dxa" w:w="50"/>
+              <w:bottom w:type="dxa" w:w="20"/>
+              <w:right w:type="dxa" w:w="50"/>
+            </w:tcMar>
+            <w:vAlign w:val="center"/>
+          </w:tcPr>
+          <w:p>
+            <w:pPr>
+              <w:spacing w:after="0" w:before="0"/>
+              <w:jc w:val="left"/>
+            </w:pPr>
+            <w:r>
+              <w:rPr>
+                <w:rFonts w:ascii="Times New Roman" w:cs="Times New Roman" w:eastAsia="Times New Roman" w:hAnsi="Times New Roman"/>
+                <w:b/>
+                <w:bCs/>
+                <w:sz w:val="15"/>
+                <w:szCs w:val="15"/>
+              </w:rPr>
+              <w:t xml:space="preserve">Ours</w:t>
+            </w:r>
+          </w:p>
+        </w:tc>
+        <w:tc>
+          <w:tcPr>
+            <w:tcW w:type="dxa" w:w="648"/>
+            <w:tcBorders>
+              <w:top w:val="none" w:color="FFFFFF" w:sz="0"/>
+              <w:left w:val="none" w:color="FFFFFF" w:sz="0"/>
+              <w:bottom w:val="single" w:color="000000" w:sz="4"/>
+              <w:right w:val="none" w:color="FFFFFF" w:sz="0"/>
+            </w:tcBorders>
+            <w:tcMar>
+              <w:top w:type="dxa" w:w="20"/>
+              <w:left w:type="dxa" w:w="50"/>
+              <w:bottom w:type="dxa" w:w="20"/>
+              <w:right w:type="dxa" w:w="50"/>
+            </w:tcMar>
+            <w:vAlign w:val="center"/>
+          </w:tcPr>
+          <w:p>
+            <w:pPr>
+              <w:spacing w:after="0" w:before="0"/>
+              <w:jc w:val="center"/>
+            </w:pPr>
+            <w:r>
+              <w:rPr>
+                <w:rFonts w:ascii="Times New Roman" w:cs="Times New Roman" w:eastAsia="Times New Roman" w:hAnsi="Times New Roman"/>
+                <w:b/>
+                <w:bCs/>
+                <w:sz w:val="15"/>
+                <w:szCs w:val="15"/>
+              </w:rPr>
+              <w:t xml:space="preserve">no</w:t>
+            </w:r>
+          </w:p>
+        </w:tc>
+        <w:tc>
+          <w:tcPr>
+            <w:tcW w:type="dxa" w:w="1584"/>
+            <w:tcBorders>
+              <w:top w:val="none" w:color="FFFFFF" w:sz="0"/>
+              <w:left w:val="none" w:color="FFFFFF" w:sz="0"/>
+              <w:bottom w:val="single" w:color="000000" w:sz="4"/>
+              <w:right w:val="none" w:color="FFFFFF" w:sz="0"/>
+            </w:tcBorders>
+            <w:tcMar>
+              <w:top w:type="dxa" w:w="20"/>
+              <w:left w:type="dxa" w:w="50"/>
+              <w:bottom w:type="dxa" w:w="20"/>
+              <w:right w:type="dxa" w:w="50"/>
+            </w:tcMar>
+            <w:vAlign w:val="center"/>
+          </w:tcPr>
+          <w:p>
+            <w:pPr>
+              <w:spacing w:after="0" w:before="0"/>
+              <w:jc w:val="center"/>
+            </w:pPr>
+            <w:r>
+              <w:rPr>
+                <w:rFonts w:ascii="Times New Roman" w:cs="Times New Roman" w:eastAsia="Times New Roman" w:hAnsi="Times New Roman"/>
+                <w:b/>
+                <w:bCs/>
+                <w:sz w:val="15"/>
+                <w:szCs w:val="15"/>
+              </w:rPr>
+              <w:t xml:space="preserve">reservoir filled only while competent, distilled</w:t>
+            </w:r>
+          </w:p>
+        </w:tc>
+        <w:tc>
+          <w:tcPr>
+            <w:tcW w:type="dxa" w:w="1440"/>
+            <w:tcBorders>
+              <w:top w:val="none" w:color="FFFFFF" w:sz="0"/>
+              <w:left w:val="none" w:color="FFFFFF" w:sz="0"/>
+              <w:bottom w:val="single" w:color="000000" w:sz="4"/>
+              <w:right w:val="none" w:color="FFFFFF" w:sz="0"/>
+            </w:tcBorders>
+            <w:tcMar>
+              <w:top w:type="dxa" w:w="20"/>
+              <w:left w:type="dxa" w:w="50"/>
+              <w:bottom w:type="dxa" w:w="20"/>
+              <w:right w:type="dxa" w:w="50"/>
+            </w:tcMar>
+            <w:vAlign w:val="center"/>
+          </w:tcPr>
+          <w:p>
+            <w:pPr>
+              <w:spacing w:after="0" w:before="0"/>
+              <w:jc w:val="center"/>
+            </w:pPr>
+            <w:r>
+              <w:rPr>
+                <w:rFonts w:ascii="Times New Roman" w:cs="Times New Roman" w:eastAsia="Times New Roman" w:hAnsi="Times New Roman"/>
+                <w:b/>
+                <w:bCs/>
+                <w:sz w:val="15"/>
+                <w:szCs w:val="15"/>
+              </w:rPr>
+              <w:t xml:space="preserve">own success collapse (all weights, Adam)</w:t>
+            </w:r>
+          </w:p>
+        </w:tc>
+      </w:tr>
+    </w:tbl>
+    <w:p>
+      <w:pPr>
+        <w:spacing w:after="80" w:before="0"/>
+      </w:pPr>
+    </w:p>
+    <w:p>
+      <w:pPr>
+        <w:keepNext/>
+        <w:spacing w:after="20" w:before="160"/>
+        <w:jc w:val="center"/>
+      </w:pPr>
+      <w:r>
+        <w:rPr>
+          <w:rFonts w:ascii="Times New Roman" w:cs="Times New Roman" w:eastAsia="Times New Roman" w:hAnsi="Times New Roman"/>
+          <w:smallCaps/>
+          <w:sz w:val="20"/>
+          <w:szCs w:val="20"/>
+        </w:rPr>
+        <w:t xml:space="preserve">III. Method</w:t>
+      </w:r>
+    </w:p>
+    <w:p>
+      <w:pPr>
+        <w:keepNext/>
+        <w:spacing w:after="60" w:before="0"/>
+        <w:jc w:val="center"/>
+      </w:pPr>
+      <w:r>
+        <w:rPr>
+          <w:rFonts w:ascii="Times New Roman" w:cs="Times New Roman" w:eastAsia="Times New Roman" w:hAnsi="Times New Roman"/>
+          <w:i/>
+          <w:iCs/>
+          <w:sz w:val="16"/>
+          <w:szCs w:val="16"/>
+        </w:rPr>
+        <w:t xml:space="preserve">AI-generated text in this section</w:t>
+      </w:r>
+      <w:r>
+        <w:rPr>
+          <w:rFonts w:ascii="Times New Roman" w:cs="Times New Roman" w:eastAsia="Times New Roman" w:hAnsi="Times New Roman"/>
+          <w:sz w:val="16"/>
+          <w:szCs w:val="16"/>
+        </w:rPr>
+        <w:t xml:space="preserve"> [1]</w:t>
+      </w:r>
+      <w:r>
+        <w:rPr>
+          <w:rFonts w:ascii="Times New Roman" w:cs="Times New Roman" w:eastAsia="Times New Roman" w:hAnsi="Times New Roman"/>
+          <w:i/>
+          <w:iCs/>
+          <w:sz w:val="16"/>
+          <w:szCs w:val="16"/>
+        </w:rPr>
+        <w:t xml:space="preserve">.</w:t>
+      </w:r>
+    </w:p>
+    <w:p>
+      <w:pPr>
+        <w:spacing w:after="0" w:before="0" w:line="240" w:lineRule="auto"/>
+        <w:ind w:firstLine="202"/>
+        <w:jc w:val="both"/>
+      </w:pPr>
+      <w:r>
+        <w:rPr>
+          <w:rFonts w:ascii="Times New Roman" w:cs="Times New Roman" w:eastAsia="Times New Roman" w:hAnsi="Times New Roman"/>
           <w:b/>
           <w:bCs/>
           <w:sz w:val="20"/>
@@ -397,7 +2052,7 @@
           <w:sz w:val="20"/>
           <w:szCs w:val="20"/>
         </w:rPr>
-        <w:t xml:space="preserve"> One agent faces tasks T1, T2, … in sequence, each for a fixed number of environment steps. It receives observations and rewards only; it is never given task identity, boundaries, or the number of tasks [16].</w:t>
+        <w:t xml:space="preserve"> One agent faces tasks T1, T2, … in sequence, each for a fixed number of environment steps. It receives observations and rewards only; it is never given task identity, boundaries, or the number of tasks.</w:t>
       </w:r>
     </w:p>
     <w:p>
@@ -646,6 +2301,872 @@
         <w:t xml:space="preserve"> If the agent had mastered (c ≥ m) and c then drops below 0.3, it logs a surprise, clears the mastered flag, and re-initialises all network parameters and the Adam state. It keeps the reservoir; from the next update, distillation pulls the fresh network back toward the stored behaviour while PPO learns the new task.</w:t>
       </w:r>
     </w:p>
+    <w:tbl>
+      <w:tblPr>
+        <w:tblW w:type="dxa" w:w="5040"/>
+        <w:tblBorders>
+          <w:top w:val="single" w:color="auto" w:sz="4"/>
+          <w:left w:val="single" w:color="auto" w:sz="4"/>
+          <w:bottom w:val="single" w:color="auto" w:sz="4"/>
+          <w:right w:val="single" w:color="auto" w:sz="4"/>
+          <w:insideH w:val="single" w:color="auto" w:sz="4"/>
+          <w:insideV w:val="single" w:color="auto" w:sz="4"/>
+        </w:tblBorders>
+      </w:tblPr>
+      <w:tblGrid>
+        <w:gridCol w:w="5040"/>
+      </w:tblGrid>
+      <w:tr>
+        <w:tc>
+          <w:tcPr>
+            <w:tcW w:type="dxa" w:w="5040"/>
+            <w:tcBorders>
+              <w:top w:val="single" w:color="000000" w:sz="4"/>
+              <w:left w:val="none" w:color="FFFFFF" w:sz="0"/>
+              <w:bottom w:val="single" w:color="000000" w:sz="4"/>
+              <w:right w:val="none" w:color="FFFFFF" w:sz="0"/>
+            </w:tcBorders>
+            <w:tcMar>
+              <w:top w:type="dxa" w:w="30"/>
+              <w:left w:type="dxa" w:w="60"/>
+              <w:bottom w:type="dxa" w:w="40"/>
+              <w:right w:type="dxa" w:w="60"/>
+            </w:tcMar>
+          </w:tcPr>
+          <w:p>
+            <w:pPr>
+              <w:keepNext/>
+              <w:keepLines/>
+              <w:pBdr>
+                <w:bottom w:val="single" w:color="000000" w:sz="4" w:space="1"/>
+              </w:pBdr>
+              <w:spacing w:after="30" w:before="0"/>
+            </w:pPr>
+            <w:r>
+              <w:rPr>
+                <w:rFonts w:ascii="Times New Roman" w:cs="Times New Roman" w:eastAsia="Times New Roman" w:hAnsi="Times New Roman"/>
+                <w:b/>
+                <w:bCs/>
+                <w:sz w:val="16"/>
+                <w:szCs w:val="16"/>
+              </w:rPr>
+              <w:t xml:space="preserve">Algorithm 1: </w:t>
+            </w:r>
+            <w:r>
+              <w:rPr>
+                <w:rFonts w:ascii="Times New Roman" w:cs="Times New Roman" w:eastAsia="Times New Roman" w:hAnsi="Times New Roman"/>
+                <w:sz w:val="16"/>
+                <w:szCs w:val="16"/>
+              </w:rPr>
+              <w:t xml:space="preserve">Boundary-blind learner (one step per PPO rollout). m = 0.8, s = 0.3, N = 8192, λ = 0.3.</w:t>
+            </w:r>
+          </w:p>
+          <w:p>
+            <w:pPr>
+              <w:keepNext/>
+              <w:keepLines/>
+              <w:tabs>
+                <w:tab w:val="left" w:pos="300"/>
+              </w:tabs>
+              <w:spacing w:after="0" w:before="0" w:line="220" w:lineRule="auto"/>
+              <w:ind w:left="300" w:hanging="300"/>
+            </w:pPr>
+            <w:r>
+              <w:rPr>
+                <w:rFonts w:ascii="Times New Roman" w:cs="Times New Roman" w:eastAsia="Times New Roman" w:hAnsi="Times New Roman"/>
+                <w:sz w:val="16"/>
+                <w:szCs w:val="16"/>
+              </w:rPr>
+              <w:t xml:space="preserve">1:</w:t>
+            </w:r>
+            <w:r>
+              <w:rPr>
+                <w:rFonts w:ascii="Times New Roman" w:cs="Times New Roman" w:eastAsia="Times New Roman" w:hAnsi="Times New Roman"/>
+                <w:sz w:val="16"/>
+                <w:szCs w:val="16"/>
+              </w:rPr>
+              <w:t xml:space="preserve">	</w:t>
+            </w:r>
+            <w:r>
+              <w:rPr>
+                <w:rFonts w:ascii="Times New Roman" w:cs="Times New Roman" w:eastAsia="Times New Roman" w:hAnsi="Times New Roman"/>
+                <w:sz w:val="16"/>
+                <w:szCs w:val="16"/>
+              </w:rPr>
+              <w:t xml:space="preserve">R ← empty reservoir of size N; H ← empty list; mastered ← false; b ← 0</w:t>
+            </w:r>
+          </w:p>
+          <w:p>
+            <w:pPr>
+              <w:keepNext/>
+              <w:keepLines/>
+              <w:tabs>
+                <w:tab w:val="left" w:pos="300"/>
+              </w:tabs>
+              <w:spacing w:after="0" w:before="0" w:line="220" w:lineRule="auto"/>
+              <w:ind w:left="300" w:hanging="300"/>
+            </w:pPr>
+            <w:r>
+              <w:rPr>
+                <w:rFonts w:ascii="Times New Roman" w:cs="Times New Roman" w:eastAsia="Times New Roman" w:hAnsi="Times New Roman"/>
+                <w:sz w:val="16"/>
+                <w:szCs w:val="16"/>
+              </w:rPr>
+              <w:t xml:space="preserve">2:</w:t>
+            </w:r>
+            <w:r>
+              <w:rPr>
+                <w:rFonts w:ascii="Times New Roman" w:cs="Times New Roman" w:eastAsia="Times New Roman" w:hAnsi="Times New Roman"/>
+                <w:sz w:val="16"/>
+                <w:szCs w:val="16"/>
+              </w:rPr>
+              <w:t xml:space="preserve">	</w:t>
+            </w:r>
+            <w:r>
+              <w:rPr>
+                <w:rFonts w:ascii="Times New Roman" w:cs="Times New Roman" w:eastAsia="Times New Roman" w:hAnsi="Times New Roman"/>
+                <w:b/>
+                <w:bCs/>
+                <w:sz w:val="16"/>
+                <w:szCs w:val="16"/>
+              </w:rPr>
+              <w:t xml:space="preserve">for</w:t>
+            </w:r>
+            <w:r>
+              <w:rPr>
+                <w:rFonts w:ascii="Times New Roman" w:cs="Times New Roman" w:eastAsia="Times New Roman" w:hAnsi="Times New Roman"/>
+                <w:sz w:val="16"/>
+                <w:szCs w:val="16"/>
+              </w:rPr>
+              <w:t xml:space="preserve"> each rollout B collected with π</w:t>
+            </w:r>
+            <w:r>
+              <w:rPr>
+                <w:rFonts w:ascii="Times New Roman" w:cs="Times New Roman" w:eastAsia="Times New Roman" w:hAnsi="Times New Roman"/>
+                <w:sz w:val="16"/>
+                <w:szCs w:val="16"/>
+                <w:vertAlign w:val="subscript"/>
+              </w:rPr>
+              <w:t xml:space="preserve">θ</w:t>
+            </w:r>
+            <w:r>
+              <w:rPr>
+                <w:rFonts w:ascii="Times New Roman" w:cs="Times New Roman" w:eastAsia="Times New Roman" w:hAnsi="Times New Roman"/>
+                <w:sz w:val="16"/>
+                <w:szCs w:val="16"/>
+              </w:rPr>
+              <w:t xml:space="preserve"> </w:t>
+            </w:r>
+            <w:r>
+              <w:rPr>
+                <w:rFonts w:ascii="Times New Roman" w:cs="Times New Roman" w:eastAsia="Times New Roman" w:hAnsi="Times New Roman"/>
+                <w:b/>
+                <w:bCs/>
+                <w:sz w:val="16"/>
+                <w:szCs w:val="16"/>
+              </w:rPr>
+              <w:t xml:space="preserve">do</w:t>
+            </w:r>
+          </w:p>
+          <w:p>
+            <w:pPr>
+              <w:keepNext/>
+              <w:keepLines/>
+              <w:tabs>
+                <w:tab w:val="left" w:pos="520"/>
+              </w:tabs>
+              <w:spacing w:after="0" w:before="0" w:line="220" w:lineRule="auto"/>
+              <w:ind w:left="520" w:hanging="520"/>
+            </w:pPr>
+            <w:r>
+              <w:rPr>
+                <w:rFonts w:ascii="Times New Roman" w:cs="Times New Roman" w:eastAsia="Times New Roman" w:hAnsi="Times New Roman"/>
+                <w:sz w:val="16"/>
+                <w:szCs w:val="16"/>
+              </w:rPr>
+              <w:t xml:space="preserve">3:</w:t>
+            </w:r>
+            <w:r>
+              <w:rPr>
+                <w:rFonts w:ascii="Times New Roman" w:cs="Times New Roman" w:eastAsia="Times New Roman" w:hAnsi="Times New Roman"/>
+                <w:sz w:val="16"/>
+                <w:szCs w:val="16"/>
+              </w:rPr>
+              <w:t xml:space="preserve">	</w:t>
+            </w:r>
+            <w:r>
+              <w:rPr>
+                <w:rFonts w:ascii="Times New Roman" w:cs="Times New Roman" w:eastAsia="Times New Roman" w:hAnsi="Times New Roman"/>
+                <w:sz w:val="16"/>
+                <w:szCs w:val="16"/>
+              </w:rPr>
+              <w:t xml:space="preserve">append the outcomes of episodes that ended in B to H; keep the last 100</w:t>
+            </w:r>
+          </w:p>
+          <w:p>
+            <w:pPr>
+              <w:keepNext/>
+              <w:keepLines/>
+              <w:tabs>
+                <w:tab w:val="left" w:pos="520"/>
+              </w:tabs>
+              <w:spacing w:after="0" w:before="0" w:line="220" w:lineRule="auto"/>
+              <w:ind w:left="520" w:hanging="520"/>
+            </w:pPr>
+            <w:r>
+              <w:rPr>
+                <w:rFonts w:ascii="Times New Roman" w:cs="Times New Roman" w:eastAsia="Times New Roman" w:hAnsi="Times New Roman"/>
+                <w:sz w:val="16"/>
+                <w:szCs w:val="16"/>
+              </w:rPr>
+              <w:t xml:space="preserve">4:</w:t>
+            </w:r>
+            <w:r>
+              <w:rPr>
+                <w:rFonts w:ascii="Times New Roman" w:cs="Times New Roman" w:eastAsia="Times New Roman" w:hAnsi="Times New Roman"/>
+                <w:sz w:val="16"/>
+                <w:szCs w:val="16"/>
+              </w:rPr>
+              <w:t xml:space="preserve">	</w:t>
+            </w:r>
+            <w:r>
+              <w:rPr>
+                <w:rFonts w:ascii="Times New Roman" w:cs="Times New Roman" w:eastAsia="Times New Roman" w:hAnsi="Times New Roman"/>
+                <w:sz w:val="16"/>
+                <w:szCs w:val="16"/>
+              </w:rPr>
+              <w:t xml:space="preserve">r ← mean(H)</w:t>
+            </w:r>
+          </w:p>
+          <w:p>
+            <w:pPr>
+              <w:keepNext/>
+              <w:keepLines/>
+              <w:tabs>
+                <w:tab w:val="left" w:pos="520"/>
+              </w:tabs>
+              <w:spacing w:after="0" w:before="0" w:line="220" w:lineRule="auto"/>
+              <w:ind w:left="520" w:hanging="520"/>
+            </w:pPr>
+            <w:r>
+              <w:rPr>
+                <w:rFonts w:ascii="Times New Roman" w:cs="Times New Roman" w:eastAsia="Times New Roman" w:hAnsi="Times New Roman"/>
+                <w:sz w:val="16"/>
+                <w:szCs w:val="16"/>
+              </w:rPr>
+              <w:t xml:space="preserve">5:</w:t>
+            </w:r>
+            <w:r>
+              <w:rPr>
+                <w:rFonts w:ascii="Times New Roman" w:cs="Times New Roman" w:eastAsia="Times New Roman" w:hAnsi="Times New Roman"/>
+                <w:sz w:val="16"/>
+                <w:szCs w:val="16"/>
+              </w:rPr>
+              <w:t xml:space="preserve">	</w:t>
+            </w:r>
+            <w:r>
+              <w:rPr>
+                <w:rFonts w:ascii="Times New Roman" w:cs="Times New Roman" w:eastAsia="Times New Roman" w:hAnsi="Times New Roman"/>
+                <w:b/>
+                <w:bCs/>
+                <w:sz w:val="16"/>
+                <w:szCs w:val="16"/>
+              </w:rPr>
+              <w:t xml:space="preserve">if</w:t>
+            </w:r>
+            <w:r>
+              <w:rPr>
+                <w:rFonts w:ascii="Times New Roman" w:cs="Times New Roman" w:eastAsia="Times New Roman" w:hAnsi="Times New Roman"/>
+                <w:sz w:val="16"/>
+                <w:szCs w:val="16"/>
+              </w:rPr>
+              <w:t xml:space="preserve"> MinAtar </w:t>
+            </w:r>
+            <w:r>
+              <w:rPr>
+                <w:rFonts w:ascii="Times New Roman" w:cs="Times New Roman" w:eastAsia="Times New Roman" w:hAnsi="Times New Roman"/>
+                <w:b/>
+                <w:bCs/>
+                <w:sz w:val="16"/>
+                <w:szCs w:val="16"/>
+              </w:rPr>
+              <w:t xml:space="preserve">then</w:t>
+            </w:r>
+            <w:r>
+              <w:rPr>
+                <w:rFonts w:ascii="Times New Roman" w:cs="Times New Roman" w:eastAsia="Times New Roman" w:hAnsi="Times New Roman"/>
+                <w:sz w:val="16"/>
+                <w:szCs w:val="16"/>
+              </w:rPr>
+              <w:t xml:space="preserve"> (</w:t>
+            </w:r>
+            <w:r>
+              <w:rPr>
+                <w:rFonts w:ascii="Times New Roman" w:cs="Times New Roman" w:eastAsia="Times New Roman" w:hAnsi="Times New Roman"/>
+                <w:b/>
+                <w:bCs/>
+                <w:sz w:val="16"/>
+                <w:szCs w:val="16"/>
+              </w:rPr>
+              <w:t xml:space="preserve">if</w:t>
+            </w:r>
+            <w:r>
+              <w:rPr>
+                <w:rFonts w:ascii="Times New Roman" w:cs="Times New Roman" w:eastAsia="Times New Roman" w:hAnsi="Times New Roman"/>
+                <w:sz w:val="16"/>
+                <w:szCs w:val="16"/>
+              </w:rPr>
+              <w:t xml:space="preserve"> |H| = 100 </w:t>
+            </w:r>
+            <w:r>
+              <w:rPr>
+                <w:rFonts w:ascii="Times New Roman" w:cs="Times New Roman" w:eastAsia="Times New Roman" w:hAnsi="Times New Roman"/>
+                <w:b/>
+                <w:bCs/>
+                <w:sz w:val="16"/>
+                <w:szCs w:val="16"/>
+              </w:rPr>
+              <w:t xml:space="preserve">then</w:t>
+            </w:r>
+            <w:r>
+              <w:rPr>
+                <w:rFonts w:ascii="Times New Roman" w:cs="Times New Roman" w:eastAsia="Times New Roman" w:hAnsi="Times New Roman"/>
+                <w:sz w:val="16"/>
+                <w:szCs w:val="16"/>
+              </w:rPr>
+              <w:t xml:space="preserve"> b ← max(b, r)); c ← r / b </w:t>
+            </w:r>
+            <w:r>
+              <w:rPr>
+                <w:rFonts w:ascii="Times New Roman" w:cs="Times New Roman" w:eastAsia="Times New Roman" w:hAnsi="Times New Roman"/>
+                <w:b/>
+                <w:bCs/>
+                <w:sz w:val="16"/>
+                <w:szCs w:val="16"/>
+              </w:rPr>
+              <w:t xml:space="preserve">else</w:t>
+            </w:r>
+            <w:r>
+              <w:rPr>
+                <w:rFonts w:ascii="Times New Roman" w:cs="Times New Roman" w:eastAsia="Times New Roman" w:hAnsi="Times New Roman"/>
+                <w:sz w:val="16"/>
+                <w:szCs w:val="16"/>
+              </w:rPr>
+              <w:t xml:space="preserve"> c ← r</w:t>
+            </w:r>
+          </w:p>
+          <w:p>
+            <w:pPr>
+              <w:keepNext/>
+              <w:keepLines/>
+              <w:tabs>
+                <w:tab w:val="left" w:pos="520"/>
+              </w:tabs>
+              <w:spacing w:after="0" w:before="0" w:line="220" w:lineRule="auto"/>
+              <w:ind w:left="520" w:hanging="520"/>
+            </w:pPr>
+            <w:r>
+              <w:rPr>
+                <w:rFonts w:ascii="Times New Roman" w:cs="Times New Roman" w:eastAsia="Times New Roman" w:hAnsi="Times New Roman"/>
+                <w:sz w:val="16"/>
+                <w:szCs w:val="16"/>
+              </w:rPr>
+              <w:t xml:space="preserve">6:</w:t>
+            </w:r>
+            <w:r>
+              <w:rPr>
+                <w:rFonts w:ascii="Times New Roman" w:cs="Times New Roman" w:eastAsia="Times New Roman" w:hAnsi="Times New Roman"/>
+                <w:sz w:val="16"/>
+                <w:szCs w:val="16"/>
+              </w:rPr>
+              <w:t xml:space="preserve">	</w:t>
+            </w:r>
+            <w:r>
+              <w:rPr>
+                <w:rFonts w:ascii="Times New Roman" w:cs="Times New Roman" w:eastAsia="Times New Roman" w:hAnsi="Times New Roman"/>
+                <w:b/>
+                <w:bCs/>
+                <w:sz w:val="16"/>
+                <w:szCs w:val="16"/>
+              </w:rPr>
+              <w:t xml:space="preserve">if</w:t>
+            </w:r>
+            <w:r>
+              <w:rPr>
+                <w:rFonts w:ascii="Times New Roman" w:cs="Times New Roman" w:eastAsia="Times New Roman" w:hAnsi="Times New Roman"/>
+                <w:sz w:val="16"/>
+                <w:szCs w:val="16"/>
+              </w:rPr>
+              <w:t xml:space="preserve"> |H| = 100 </w:t>
+            </w:r>
+            <w:r>
+              <w:rPr>
+                <w:rFonts w:ascii="Times New Roman" w:cs="Times New Roman" w:eastAsia="Times New Roman" w:hAnsi="Times New Roman"/>
+                <w:b/>
+                <w:bCs/>
+                <w:sz w:val="16"/>
+                <w:szCs w:val="16"/>
+              </w:rPr>
+              <w:t xml:space="preserve">and</w:t>
+            </w:r>
+            <w:r>
+              <w:rPr>
+                <w:rFonts w:ascii="Times New Roman" w:cs="Times New Roman" w:eastAsia="Times New Roman" w:hAnsi="Times New Roman"/>
+                <w:sz w:val="16"/>
+                <w:szCs w:val="16"/>
+              </w:rPr>
+              <w:t xml:space="preserve"> c ≥ m </w:t>
+            </w:r>
+            <w:r>
+              <w:rPr>
+                <w:rFonts w:ascii="Times New Roman" w:cs="Times New Roman" w:eastAsia="Times New Roman" w:hAnsi="Times New Roman"/>
+                <w:b/>
+                <w:bCs/>
+                <w:sz w:val="16"/>
+                <w:szCs w:val="16"/>
+              </w:rPr>
+              <w:t xml:space="preserve">then</w:t>
+            </w:r>
+          </w:p>
+          <w:p>
+            <w:pPr>
+              <w:keepNext/>
+              <w:keepLines/>
+              <w:tabs>
+                <w:tab w:val="left" w:pos="740"/>
+              </w:tabs>
+              <w:spacing w:after="0" w:before="0" w:line="220" w:lineRule="auto"/>
+              <w:ind w:left="740" w:hanging="740"/>
+            </w:pPr>
+            <w:r>
+              <w:rPr>
+                <w:rFonts w:ascii="Times New Roman" w:cs="Times New Roman" w:eastAsia="Times New Roman" w:hAnsi="Times New Roman"/>
+                <w:sz w:val="16"/>
+                <w:szCs w:val="16"/>
+              </w:rPr>
+              <w:t xml:space="preserve">7:</w:t>
+            </w:r>
+            <w:r>
+              <w:rPr>
+                <w:rFonts w:ascii="Times New Roman" w:cs="Times New Roman" w:eastAsia="Times New Roman" w:hAnsi="Times New Roman"/>
+                <w:sz w:val="16"/>
+                <w:szCs w:val="16"/>
+              </w:rPr>
+              <w:t xml:space="preserve">	</w:t>
+            </w:r>
+            <w:r>
+              <w:rPr>
+                <w:rFonts w:ascii="Times New Roman" w:cs="Times New Roman" w:eastAsia="Times New Roman" w:hAnsi="Times New Roman"/>
+                <w:sz w:val="16"/>
+                <w:szCs w:val="16"/>
+              </w:rPr>
+              <w:t xml:space="preserve">mastered ← true</w:t>
+            </w:r>
+          </w:p>
+          <w:p>
+            <w:pPr>
+              <w:keepNext/>
+              <w:keepLines/>
+              <w:tabs>
+                <w:tab w:val="left" w:pos="740"/>
+              </w:tabs>
+              <w:spacing w:after="0" w:before="0" w:line="220" w:lineRule="auto"/>
+              <w:ind w:left="740" w:hanging="740"/>
+            </w:pPr>
+            <w:r>
+              <w:rPr>
+                <w:rFonts w:ascii="Times New Roman" w:cs="Times New Roman" w:eastAsia="Times New Roman" w:hAnsi="Times New Roman"/>
+                <w:sz w:val="16"/>
+                <w:szCs w:val="16"/>
+              </w:rPr>
+              <w:t xml:space="preserve">8:</w:t>
+            </w:r>
+            <w:r>
+              <w:rPr>
+                <w:rFonts w:ascii="Times New Roman" w:cs="Times New Roman" w:eastAsia="Times New Roman" w:hAnsi="Times New Roman"/>
+                <w:sz w:val="16"/>
+                <w:szCs w:val="16"/>
+              </w:rPr>
+              <w:t xml:space="preserve">	</w:t>
+            </w:r>
+            <w:r>
+              <w:rPr>
+                <w:rFonts w:ascii="Times New Roman" w:cs="Times New Roman" w:eastAsia="Times New Roman" w:hAnsi="Times New Roman"/>
+                <w:sz w:val="16"/>
+                <w:szCs w:val="16"/>
+              </w:rPr>
+              <w:t xml:space="preserve">offer 256 random observations o of B, with log π</w:t>
+            </w:r>
+            <w:r>
+              <w:rPr>
+                <w:rFonts w:ascii="Times New Roman" w:cs="Times New Roman" w:eastAsia="Times New Roman" w:hAnsi="Times New Roman"/>
+                <w:sz w:val="16"/>
+                <w:szCs w:val="16"/>
+                <w:vertAlign w:val="subscript"/>
+              </w:rPr>
+              <w:t xml:space="preserve">θ</w:t>
+            </w:r>
+            <w:r>
+              <w:rPr>
+                <w:rFonts w:ascii="Times New Roman" w:cs="Times New Roman" w:eastAsia="Times New Roman" w:hAnsi="Times New Roman"/>
+                <w:sz w:val="16"/>
+                <w:szCs w:val="16"/>
+              </w:rPr>
+              <w:t xml:space="preserve">(·|o), to R by reservoir sampling</w:t>
+            </w:r>
+          </w:p>
+          <w:p>
+            <w:pPr>
+              <w:keepNext/>
+              <w:keepLines/>
+              <w:tabs>
+                <w:tab w:val="left" w:pos="520"/>
+              </w:tabs>
+              <w:spacing w:after="0" w:before="0" w:line="220" w:lineRule="auto"/>
+              <w:ind w:left="520" w:hanging="520"/>
+            </w:pPr>
+            <w:r>
+              <w:rPr>
+                <w:rFonts w:ascii="Times New Roman" w:cs="Times New Roman" w:eastAsia="Times New Roman" w:hAnsi="Times New Roman"/>
+                <w:sz w:val="16"/>
+                <w:szCs w:val="16"/>
+              </w:rPr>
+              <w:t xml:space="preserve">9:</w:t>
+            </w:r>
+            <w:r>
+              <w:rPr>
+                <w:rFonts w:ascii="Times New Roman" w:cs="Times New Roman" w:eastAsia="Times New Roman" w:hAnsi="Times New Roman"/>
+                <w:sz w:val="16"/>
+                <w:szCs w:val="16"/>
+              </w:rPr>
+              <w:t xml:space="preserve">	</w:t>
+            </w:r>
+            <w:r>
+              <w:rPr>
+                <w:rFonts w:ascii="Times New Roman" w:cs="Times New Roman" w:eastAsia="Times New Roman" w:hAnsi="Times New Roman"/>
+                <w:b/>
+                <w:bCs/>
+                <w:sz w:val="16"/>
+                <w:szCs w:val="16"/>
+              </w:rPr>
+              <w:t xml:space="preserve">else if</w:t>
+            </w:r>
+            <w:r>
+              <w:rPr>
+                <w:rFonts w:ascii="Times New Roman" w:cs="Times New Roman" w:eastAsia="Times New Roman" w:hAnsi="Times New Roman"/>
+                <w:sz w:val="16"/>
+                <w:szCs w:val="16"/>
+              </w:rPr>
+              <w:t xml:space="preserve"> mastered </w:t>
+            </w:r>
+            <w:r>
+              <w:rPr>
+                <w:rFonts w:ascii="Times New Roman" w:cs="Times New Roman" w:eastAsia="Times New Roman" w:hAnsi="Times New Roman"/>
+                <w:b/>
+                <w:bCs/>
+                <w:sz w:val="16"/>
+                <w:szCs w:val="16"/>
+              </w:rPr>
+              <w:t xml:space="preserve">and</w:t>
+            </w:r>
+            <w:r>
+              <w:rPr>
+                <w:rFonts w:ascii="Times New Roman" w:cs="Times New Roman" w:eastAsia="Times New Roman" w:hAnsi="Times New Roman"/>
+                <w:sz w:val="16"/>
+                <w:szCs w:val="16"/>
+              </w:rPr>
+              <w:t xml:space="preserve"> c &lt; s </w:t>
+            </w:r>
+            <w:r>
+              <w:rPr>
+                <w:rFonts w:ascii="Times New Roman" w:cs="Times New Roman" w:eastAsia="Times New Roman" w:hAnsi="Times New Roman"/>
+                <w:b/>
+                <w:bCs/>
+                <w:sz w:val="16"/>
+                <w:szCs w:val="16"/>
+              </w:rPr>
+              <w:t xml:space="preserve">then</w:t>
+            </w:r>
+            <w:r>
+              <w:rPr>
+                <w:rFonts w:ascii="Times New Roman" w:cs="Times New Roman" w:eastAsia="Times New Roman" w:hAnsi="Times New Roman"/>
+                <w:sz w:val="16"/>
+                <w:szCs w:val="16"/>
+              </w:rPr>
+              <w:t xml:space="preserve">  ▷ surprise</w:t>
+            </w:r>
+          </w:p>
+          <w:p>
+            <w:pPr>
+              <w:keepNext/>
+              <w:keepLines/>
+              <w:tabs>
+                <w:tab w:val="left" w:pos="740"/>
+              </w:tabs>
+              <w:spacing w:after="0" w:before="0" w:line="220" w:lineRule="auto"/>
+              <w:ind w:left="740" w:hanging="740"/>
+            </w:pPr>
+            <w:r>
+              <w:rPr>
+                <w:rFonts w:ascii="Times New Roman" w:cs="Times New Roman" w:eastAsia="Times New Roman" w:hAnsi="Times New Roman"/>
+                <w:sz w:val="16"/>
+                <w:szCs w:val="16"/>
+              </w:rPr>
+              <w:t xml:space="preserve">10:</w:t>
+            </w:r>
+            <w:r>
+              <w:rPr>
+                <w:rFonts w:ascii="Times New Roman" w:cs="Times New Roman" w:eastAsia="Times New Roman" w:hAnsi="Times New Roman"/>
+                <w:sz w:val="16"/>
+                <w:szCs w:val="16"/>
+              </w:rPr>
+              <w:t xml:space="preserve">	</w:t>
+            </w:r>
+            <w:r>
+              <w:rPr>
+                <w:rFonts w:ascii="Times New Roman" w:cs="Times New Roman" w:eastAsia="Times New Roman" w:hAnsi="Times New Roman"/>
+                <w:sz w:val="16"/>
+                <w:szCs w:val="16"/>
+              </w:rPr>
+              <w:t xml:space="preserve">mastered ← false; b ← r</w:t>
+            </w:r>
+          </w:p>
+          <w:p>
+            <w:pPr>
+              <w:keepNext/>
+              <w:keepLines/>
+              <w:tabs>
+                <w:tab w:val="left" w:pos="740"/>
+              </w:tabs>
+              <w:spacing w:after="0" w:before="0" w:line="220" w:lineRule="auto"/>
+              <w:ind w:left="740" w:hanging="740"/>
+            </w:pPr>
+            <w:r>
+              <w:rPr>
+                <w:rFonts w:ascii="Times New Roman" w:cs="Times New Roman" w:eastAsia="Times New Roman" w:hAnsi="Times New Roman"/>
+                <w:sz w:val="16"/>
+                <w:szCs w:val="16"/>
+              </w:rPr>
+              <w:t xml:space="preserve">11:</w:t>
+            </w:r>
+            <w:r>
+              <w:rPr>
+                <w:rFonts w:ascii="Times New Roman" w:cs="Times New Roman" w:eastAsia="Times New Roman" w:hAnsi="Times New Roman"/>
+                <w:sz w:val="16"/>
+                <w:szCs w:val="16"/>
+              </w:rPr>
+              <w:t xml:space="preserve">	</w:t>
+            </w:r>
+            <w:r>
+              <w:rPr>
+                <w:rFonts w:ascii="Times New Roman" w:cs="Times New Roman" w:eastAsia="Times New Roman" w:hAnsi="Times New Roman"/>
+                <w:sz w:val="16"/>
+                <w:szCs w:val="16"/>
+              </w:rPr>
+              <w:t xml:space="preserve">re-initialise all weights θ and clear the Adam state; keep R</w:t>
+            </w:r>
+          </w:p>
+          <w:p>
+            <w:pPr>
+              <w:keepNext/>
+              <w:keepLines/>
+              <w:tabs>
+                <w:tab w:val="left" w:pos="520"/>
+              </w:tabs>
+              <w:spacing w:after="0" w:before="0" w:line="220" w:lineRule="auto"/>
+              <w:ind w:left="520" w:hanging="520"/>
+            </w:pPr>
+            <w:r>
+              <w:rPr>
+                <w:rFonts w:ascii="Times New Roman" w:cs="Times New Roman" w:eastAsia="Times New Roman" w:hAnsi="Times New Roman"/>
+                <w:sz w:val="16"/>
+                <w:szCs w:val="16"/>
+              </w:rPr>
+              <w:t xml:space="preserve">12:</w:t>
+            </w:r>
+            <w:r>
+              <w:rPr>
+                <w:rFonts w:ascii="Times New Roman" w:cs="Times New Roman" w:eastAsia="Times New Roman" w:hAnsi="Times New Roman"/>
+                <w:sz w:val="16"/>
+                <w:szCs w:val="16"/>
+              </w:rPr>
+              <w:t xml:space="preserve">	</w:t>
+            </w:r>
+            <w:r>
+              <w:rPr>
+                <w:rFonts w:ascii="Times New Roman" w:cs="Times New Roman" w:eastAsia="Times New Roman" w:hAnsi="Times New Roman"/>
+                <w:b/>
+                <w:bCs/>
+                <w:sz w:val="16"/>
+                <w:szCs w:val="16"/>
+              </w:rPr>
+              <w:t xml:space="preserve">for</w:t>
+            </w:r>
+            <w:r>
+              <w:rPr>
+                <w:rFonts w:ascii="Times New Roman" w:cs="Times New Roman" w:eastAsia="Times New Roman" w:hAnsi="Times New Roman"/>
+                <w:sz w:val="16"/>
+                <w:szCs w:val="16"/>
+              </w:rPr>
+              <w:t xml:space="preserve"> each PPO minibatch of B </w:t>
+            </w:r>
+            <w:r>
+              <w:rPr>
+                <w:rFonts w:ascii="Times New Roman" w:cs="Times New Roman" w:eastAsia="Times New Roman" w:hAnsi="Times New Roman"/>
+                <w:b/>
+                <w:bCs/>
+                <w:sz w:val="16"/>
+                <w:szCs w:val="16"/>
+              </w:rPr>
+              <w:t xml:space="preserve">do</w:t>
+            </w:r>
+          </w:p>
+          <w:p>
+            <w:pPr>
+              <w:keepNext/>
+              <w:keepLines/>
+              <w:tabs>
+                <w:tab w:val="left" w:pos="740"/>
+              </w:tabs>
+              <w:spacing w:after="0" w:before="0" w:line="220" w:lineRule="auto"/>
+              <w:ind w:left="740" w:hanging="740"/>
+            </w:pPr>
+            <w:r>
+              <w:rPr>
+                <w:rFonts w:ascii="Times New Roman" w:cs="Times New Roman" w:eastAsia="Times New Roman" w:hAnsi="Times New Roman"/>
+                <w:sz w:val="16"/>
+                <w:szCs w:val="16"/>
+              </w:rPr>
+              <w:t xml:space="preserve">13:</w:t>
+            </w:r>
+            <w:r>
+              <w:rPr>
+                <w:rFonts w:ascii="Times New Roman" w:cs="Times New Roman" w:eastAsia="Times New Roman" w:hAnsi="Times New Roman"/>
+                <w:sz w:val="16"/>
+                <w:szCs w:val="16"/>
+              </w:rPr>
+              <w:t xml:space="preserve">	</w:t>
+            </w:r>
+            <w:r>
+              <w:rPr>
+                <w:rFonts w:ascii="Times New Roman" w:cs="Times New Roman" w:eastAsia="Times New Roman" w:hAnsi="Times New Roman"/>
+                <w:sz w:val="16"/>
+                <w:szCs w:val="16"/>
+              </w:rPr>
+              <w:t xml:space="preserve">loss ← L</w:t>
+            </w:r>
+            <w:r>
+              <w:rPr>
+                <w:rFonts w:ascii="Times New Roman" w:cs="Times New Roman" w:eastAsia="Times New Roman" w:hAnsi="Times New Roman"/>
+                <w:sz w:val="16"/>
+                <w:szCs w:val="16"/>
+                <w:vertAlign w:val="subscript"/>
+              </w:rPr>
+              <w:t xml:space="preserve">PPO</w:t>
+            </w:r>
+            <w:r>
+              <w:rPr>
+                <w:rFonts w:ascii="Times New Roman" w:cs="Times New Roman" w:eastAsia="Times New Roman" w:hAnsi="Times New Roman"/>
+                <w:sz w:val="16"/>
+                <w:szCs w:val="16"/>
+              </w:rPr>
+              <w:t xml:space="preserve"> + λ · mean</w:t>
+            </w:r>
+            <w:r>
+              <w:rPr>
+                <w:rFonts w:ascii="Times New Roman" w:cs="Times New Roman" w:eastAsia="Times New Roman" w:hAnsi="Times New Roman"/>
+                <w:sz w:val="16"/>
+                <w:szCs w:val="16"/>
+                <w:vertAlign w:val="subscript"/>
+              </w:rPr>
+              <w:t xml:space="preserve">o∈D</w:t>
+            </w:r>
+            <w:r>
+              <w:rPr>
+                <w:rFonts w:ascii="Times New Roman" w:cs="Times New Roman" w:eastAsia="Times New Roman" w:hAnsi="Times New Roman"/>
+                <w:sz w:val="16"/>
+                <w:szCs w:val="16"/>
+              </w:rPr>
+              <w:t xml:space="preserve"> KL(π</w:t>
+            </w:r>
+            <w:r>
+              <w:rPr>
+                <w:rFonts w:ascii="Times New Roman" w:cs="Times New Roman" w:eastAsia="Times New Roman" w:hAnsi="Times New Roman"/>
+                <w:sz w:val="16"/>
+                <w:szCs w:val="16"/>
+                <w:vertAlign w:val="subscript"/>
+              </w:rPr>
+              <w:t xml:space="preserve">R</w:t>
+            </w:r>
+            <w:r>
+              <w:rPr>
+                <w:rFonts w:ascii="Times New Roman" w:cs="Times New Roman" w:eastAsia="Times New Roman" w:hAnsi="Times New Roman"/>
+                <w:sz w:val="16"/>
+                <w:szCs w:val="16"/>
+              </w:rPr>
+              <w:t xml:space="preserve">(·|o) ‖ π</w:t>
+            </w:r>
+            <w:r>
+              <w:rPr>
+                <w:rFonts w:ascii="Times New Roman" w:cs="Times New Roman" w:eastAsia="Times New Roman" w:hAnsi="Times New Roman"/>
+                <w:sz w:val="16"/>
+                <w:szCs w:val="16"/>
+                <w:vertAlign w:val="subscript"/>
+              </w:rPr>
+              <w:t xml:space="preserve">θ</w:t>
+            </w:r>
+            <w:r>
+              <w:rPr>
+                <w:rFonts w:ascii="Times New Roman" w:cs="Times New Roman" w:eastAsia="Times New Roman" w:hAnsi="Times New Roman"/>
+                <w:sz w:val="16"/>
+                <w:szCs w:val="16"/>
+              </w:rPr>
+              <w:t xml:space="preserve">(·|o)), D = 256 random items of R</w:t>
+            </w:r>
+          </w:p>
+          <w:p>
+            <w:pPr>
+              <w:keepNext/>
+              <w:keepLines/>
+              <w:tabs>
+                <w:tab w:val="left" w:pos="740"/>
+              </w:tabs>
+              <w:spacing w:after="0" w:before="0" w:line="220" w:lineRule="auto"/>
+              <w:ind w:left="740" w:hanging="740"/>
+            </w:pPr>
+            <w:r>
+              <w:rPr>
+                <w:rFonts w:ascii="Times New Roman" w:cs="Times New Roman" w:eastAsia="Times New Roman" w:hAnsi="Times New Roman"/>
+                <w:sz w:val="16"/>
+                <w:szCs w:val="16"/>
+              </w:rPr>
+              <w:t xml:space="preserve">14:</w:t>
+            </w:r>
+            <w:r>
+              <w:rPr>
+                <w:rFonts w:ascii="Times New Roman" w:cs="Times New Roman" w:eastAsia="Times New Roman" w:hAnsi="Times New Roman"/>
+                <w:sz w:val="16"/>
+                <w:szCs w:val="16"/>
+              </w:rPr>
+              <w:t xml:space="preserve">	</w:t>
+            </w:r>
+            <w:r>
+              <w:rPr>
+                <w:rFonts w:ascii="Times New Roman" w:cs="Times New Roman" w:eastAsia="Times New Roman" w:hAnsi="Times New Roman"/>
+                <w:sz w:val="16"/>
+                <w:szCs w:val="16"/>
+              </w:rPr>
+              <w:t xml:space="preserve">take an Adam step on loss</w:t>
+            </w:r>
+          </w:p>
+        </w:tc>
+      </w:tr>
+    </w:tbl>
+    <w:p>
+      <w:pPr>
+        <w:spacing w:after="100" w:before="0"/>
+      </w:pPr>
+    </w:p>
     <w:p>
       <w:pPr>
         <w:spacing w:after="0" w:before="0" w:line="240" w:lineRule="auto"/>
@@ -674,7 +3195,7 @@
     <w:p>
       <w:pPr>
         <w:keepNext/>
-        <w:spacing w:after="80" w:before="160"/>
+        <w:spacing w:after="20" w:before="160"/>
         <w:jc w:val="center"/>
       </w:pPr>
       <w:r>
@@ -685,6 +3206,41 @@
           <w:szCs w:val="20"/>
         </w:rPr>
         <w:t xml:space="preserve">IV. Experimental Setup</w:t>
+      </w:r>
+    </w:p>
+    <w:p>
+      <w:pPr>
+        <w:keepNext/>
+        <w:spacing w:after="60" w:before="0"/>
+        <w:jc w:val="center"/>
+      </w:pPr>
+      <w:r>
+        <w:rPr>
+          <w:rFonts w:ascii="Times New Roman" w:cs="Times New Roman" w:eastAsia="Times New Roman" w:hAnsi="Times New Roman"/>
+          <w:i/>
+          <w:iCs/>
+          <w:sz w:val="16"/>
+          <w:szCs w:val="16"/>
+        </w:rPr>
+        <w:t xml:space="preserve">AI-generated text in this section</w:t>
+      </w:r>
+      <w:r>
+        <w:rPr>
+          <w:rFonts w:ascii="Times New Roman" w:cs="Times New Roman" w:eastAsia="Times New Roman" w:hAnsi="Times New Roman"/>
+          <w:sz w:val="16"/>
+          <w:szCs w:val="16"/>
+        </w:rPr>
+        <w:t xml:space="preserve"> [1]</w:t>
+      </w:r>
+      <w:r>
+        <w:rPr>
+          <w:rFonts w:ascii="Times New Roman" w:cs="Times New Roman" w:eastAsia="Times New Roman" w:hAnsi="Times New Roman"/>
+          <w:i/>
+          <w:iCs/>
+          <w:sz w:val="16"/>
+          <w:szCs w:val="16"/>
+        </w:rPr>
+        <w:t xml:space="preserve">.</w:t>
       </w:r>
     </w:p>
     <w:p>
@@ -745,7 +3301,7 @@
           <w:sz w:val="20"/>
           <w:szCs w:val="20"/>
         </w:rPr>
-        <w:t xml:space="preserve"> Empty, DoorKey, LavaGap, Dynamic-Obstacles, SimpleCrossing, Unlock, DoorKey (revisit), LavaGap (revisit), 500k steps per stage; 11 tests of trained kinds and sizes plus KeyCorridor (never trained), 30 episodes each. The metric is the mean final success over the trained tests [16].</w:t>
+        <w:t xml:space="preserve"> Empty, DoorKey, LavaGap, Dynamic-Obstacles, SimpleCrossing, Unlock, DoorKey (revisit), LavaGap (revisit), 500k steps per stage; 11 tests of trained kinds and sizes plus KeyCorridor (never trained), 30 episodes each. The metric is the mean final success over the trained tests.</w:t>
       </w:r>
     </w:p>
     <w:p>
@@ -831,7 +3387,7 @@
           <w:sz w:val="20"/>
           <w:szCs w:val="20"/>
         </w:rPr>
-        <w:t xml:space="preserve"> [10], adapted to PPO: a reservoir of all past experience (same size, 8192), an off-policy clipped importance-weighted policy gradient on replay, plus coefficient × (policy KL + value MSE) cloning; coefficient 1.0 chosen on MiniGrid tuning seeds (0.1 is also reported for MinAtar). It is our adaptation, not the original IMPALA implementation. </w:t>
+        <w:t xml:space="preserve"> [11], adapted to PPO: a reservoir of all past experience (same size, 8192), an off-policy clipped importance-weighted policy gradient on replay, plus coefficient × (policy KL + value MSE) cloning; coefficient 1.0 chosen on MiniGrid tuning seeds (0.1 is also reported for MinAtar). It is our adaptation, not the original IMPALA implementation. </w:t>
       </w:r>
       <w:r>
         <w:rPr>
@@ -885,7 +3441,7 @@
           <w:sz w:val="20"/>
           <w:szCs w:val="20"/>
         </w:rPr>
-        <w:t xml:space="preserve"> [4], adapted to PPO: told each task end; full reset plus distillation toward the last rollout of every finished task. </w:t>
+        <w:t xml:space="preserve"> [5], adapted to PPO: told each task end; full reset plus distillation toward the last rollout of every finished task. </w:t>
       </w:r>
       <w:r>
         <w:rPr>
@@ -928,13 +3484,13 @@
           <w:sz w:val="20"/>
           <w:szCs w:val="20"/>
         </w:rPr>
-        <w:t xml:space="preserve"> Tuning seeds 101–105; final seeds 1–20 (Sec. I). We report mean ± 95% confidence interval (t-distribution) and paired differences over seeds with the number of seeds where ours is higher. Analyses in Sec. VI use seeds 1–10 unless stated. Every result file stores its configuration and code commit; runs are bit-exact per seed on the final code, and six baseline groups whose first ten seeds predate version control were re-run before pooling. All runs used one 12-thread CPU.</w:t>
+        <w:t xml:space="preserve"> Tuning seeds 101–105; final seeds 1–20 (Sec. I). We report mean ± 95% confidence interval (t-distribution) and paired differences over seeds with the number of seeds where ours is higher. We call a difference significant only when the 95% CI of the paired difference excludes zero; otherwise we say “on par” or “n.s.”. Analyses in Sec. VI use seeds 1–10 unless stated. Every result file stores its configuration and code commit; runs are bit-exact per seed on the final code, and six baseline groups whose first ten seeds predate version control were re-run before pooling. All runs used one 12-thread CPU.</w:t>
       </w:r>
     </w:p>
     <w:p>
       <w:pPr>
         <w:keepNext/>
-        <w:spacing w:after="80" w:before="160"/>
+        <w:spacing w:after="20" w:before="160"/>
         <w:jc w:val="center"/>
       </w:pPr>
       <w:r>
@@ -945,6 +3501,41 @@
           <w:szCs w:val="20"/>
         </w:rPr>
         <w:t xml:space="preserve">V. Results</w:t>
+      </w:r>
+    </w:p>
+    <w:p>
+      <w:pPr>
+        <w:keepNext/>
+        <w:spacing w:after="60" w:before="0"/>
+        <w:jc w:val="center"/>
+      </w:pPr>
+      <w:r>
+        <w:rPr>
+          <w:rFonts w:ascii="Times New Roman" w:cs="Times New Roman" w:eastAsia="Times New Roman" w:hAnsi="Times New Roman"/>
+          <w:i/>
+          <w:iCs/>
+          <w:sz w:val="16"/>
+          <w:szCs w:val="16"/>
+        </w:rPr>
+        <w:t xml:space="preserve">AI-generated text in this section</w:t>
+      </w:r>
+      <w:r>
+        <w:rPr>
+          <w:rFonts w:ascii="Times New Roman" w:cs="Times New Roman" w:eastAsia="Times New Roman" w:hAnsi="Times New Roman"/>
+          <w:sz w:val="16"/>
+          <w:szCs w:val="16"/>
+        </w:rPr>
+        <w:t xml:space="preserve"> [1]</w:t>
+      </w:r>
+      <w:r>
+        <w:rPr>
+          <w:rFonts w:ascii="Times New Roman" w:cs="Times New Roman" w:eastAsia="Times New Roman" w:hAnsi="Times New Roman"/>
+          <w:i/>
+          <w:iCs/>
+          <w:sz w:val="16"/>
+          <w:szCs w:val="16"/>
+        </w:rPr>
+        <w:t xml:space="preserve">.</w:t>
       </w:r>
     </w:p>
     <w:p>
@@ -976,7 +3567,7 @@
           <w:sz w:val="16"/>
           <w:szCs w:val="16"/>
         </w:rPr>
-        <w:t xml:space="preserve">TABLE I</w:t>
+        <w:t xml:space="preserve">TABLE II</w:t>
       </w:r>
     </w:p>
     <w:p>
@@ -1386,7 +3977,7 @@
                 <w:sz w:val="15"/>
                 <w:szCs w:val="15"/>
               </w:rPr>
-              <w:t xml:space="preserve">CLEAR [10]</w:t>
+              <w:t xml:space="preserve">CLEAR [11]</w:t>
             </w:r>
           </w:p>
         </w:tc>
@@ -1881,7 +4472,7 @@
                 <w:sz w:val="15"/>
                 <w:szCs w:val="15"/>
               </w:rPr>
-              <w:t xml:space="preserve">Reset &amp; Distill [4]</w:t>
+              <w:t xml:space="preserve">Reset &amp; Distill [5]</w:t>
             </w:r>
           </w:p>
         </w:tc>
@@ -2372,7 +4963,7 @@
           <w:sz w:val="20"/>
           <w:szCs w:val="20"/>
         </w:rPr>
-        <w:t xml:space="preserve">On the 8-stage sequence L1 (Table I, Fig. 2), the agent that is never told anything keeps 92.7% (worst seed 89), on par with told distillation (+1.9 ± 3.3), and above CLEAR (+24.9 ± 2.1, 20/20 seeds), joint training (+6.5 ± 4.9, 17/20) and no protection (+59.7 ± 4.6, 20/20). CLEAR keeps early tasks but learns the new kinds (Obstacles, Crossing) poorly: replaying everything holds the policy to old behaviour. KeyCorridor, never trained, stays at 0% for all methods: there is no zero-shot composition [16].</w:t>
+        <w:t xml:space="preserve">On the 8-stage sequence L1 (Table II, Fig. 2), the agent that is never told anything keeps 92.7% (worst seed 89), on par with told distillation (+1.9 ± 3.3), and above CLEAR (+24.9 ± 2.1, 20/20 seeds), joint training (+6.5 ± 4.9, 17/20) and no protection (+59.7 ± 4.6, 20/20). CLEAR keeps early tasks but learns the new kinds (Obstacles, Crossing) poorly: replaying everything holds the policy to old behaviour. KeyCorridor, never trained, stays at 0% for all methods: there is no zero-shot composition.</w:t>
       </w:r>
     </w:p>
     <w:p>
@@ -2488,7 +5079,7 @@
           <w:sz w:val="16"/>
           <w:szCs w:val="16"/>
         </w:rPr>
-        <w:t xml:space="preserve">TABLE II</w:t>
+        <w:t xml:space="preserve">TABLE III</w:t>
       </w:r>
     </w:p>
     <w:p>
@@ -3631,7 +6222,7 @@
           <w:sz w:val="20"/>
           <w:szCs w:val="20"/>
         </w:rPr>
-        <w:t xml:space="preserve">The MiniGrid settings were reused; nothing method-specific was tuned on MinAtar except choosing the full reset by a rule fixed in advance (Sec. VI-B). Ours keeps 44.4% of single-game scores after all five games (Table II, Fig. 3), above CLEAR at its best coefficient, no protection and our joint baseline, and on par with Reset &amp; Distill, which is told every boundary. The surprise fired within 500k steps of every game switch (all 4 switches, 10/10 seeds). CLEAR's weakness here is plasticity, not memory: it learns new games at only 22% of scratch. Joint training is not an upper bound on MinAtar: even with 20M steps it never learns Freeway, Asterix or Seaquest, consistent with the interference reported for multi-task SAC [8]; we therefore claim “above our joint baseline”, not “above joint training”. Retention is partial: games learned first keep the least.</w:t>
+        <w:t xml:space="preserve">The MiniGrid settings were reused; nothing method-specific was tuned on MinAtar except choosing the full reset by a rule fixed in advance (Sec. VI-B). Ours keeps 44.4% of single-game scores after all five games (Table III, Fig. 3), above CLEAR at its best coefficient, no protection and our joint baseline, and on par with Reset &amp; Distill, which is told every boundary. The surprise fired within 500k steps of every game switch (all 4 switches, 10/10 seeds). CLEAR's weakness here is plasticity, not memory: it learns new games at only 22% of scratch. Joint training is not an upper bound on MinAtar: even with 20M steps it never learns Freeway, Asterix or Seaquest, consistent with the interference reported for multi-task SAC [9]; we therefore claim “above our joint baseline”, not “above joint training”. Retention is partial: games learned first keep the least.</w:t>
       </w:r>
     </w:p>
     <w:p>
@@ -3737,7 +6328,7 @@
     <w:p>
       <w:pPr>
         <w:keepNext/>
-        <w:spacing w:after="80" w:before="160"/>
+        <w:spacing w:after="20" w:before="160"/>
         <w:jc w:val="center"/>
       </w:pPr>
       <w:r>
@@ -3748,6 +6339,41 @@
           <w:szCs w:val="20"/>
         </w:rPr>
         <w:t xml:space="preserve">VI. Analysis</w:t>
+      </w:r>
+    </w:p>
+    <w:p>
+      <w:pPr>
+        <w:keepNext/>
+        <w:spacing w:after="60" w:before="0"/>
+        <w:jc w:val="center"/>
+      </w:pPr>
+      <w:r>
+        <w:rPr>
+          <w:rFonts w:ascii="Times New Roman" w:cs="Times New Roman" w:eastAsia="Times New Roman" w:hAnsi="Times New Roman"/>
+          <w:i/>
+          <w:iCs/>
+          <w:sz w:val="16"/>
+          <w:szCs w:val="16"/>
+        </w:rPr>
+        <w:t xml:space="preserve">AI-generated text in this section</w:t>
+      </w:r>
+      <w:r>
+        <w:rPr>
+          <w:rFonts w:ascii="Times New Roman" w:cs="Times New Roman" w:eastAsia="Times New Roman" w:hAnsi="Times New Roman"/>
+          <w:sz w:val="16"/>
+          <w:szCs w:val="16"/>
+        </w:rPr>
+        <w:t xml:space="preserve"> [1]</w:t>
+      </w:r>
+      <w:r>
+        <w:rPr>
+          <w:rFonts w:ascii="Times New Roman" w:cs="Times New Roman" w:eastAsia="Times New Roman" w:hAnsi="Times New Roman"/>
+          <w:i/>
+          <w:iCs/>
+          <w:sz w:val="16"/>
+          <w:szCs w:val="16"/>
+        </w:rPr>
+        <w:t xml:space="preserve">.</w:t>
       </w:r>
     </w:p>
     <w:p>
@@ -3763,7 +6389,7 @@
           <w:sz w:val="16"/>
           <w:szCs w:val="16"/>
         </w:rPr>
-        <w:t xml:space="preserve">TABLE III</w:t>
+        <w:t xml:space="preserve">TABLE IV</w:t>
       </w:r>
     </w:p>
     <w:p>
@@ -4647,7 +7273,7 @@
           <w:sz w:val="20"/>
           <w:szCs w:val="20"/>
         </w:rPr>
-        <w:t xml:space="preserve">Without the reservoir, the full reset learns each new MinAtar game at 105% of scratch, but the final score falls to 25.3% (Table III); on MiniGrid C1 it falls to 39.0%. The reset brings back the ability to learn; the memory carries the past [16].</w:t>
+        <w:t xml:space="preserve">Without the reservoir, the full reset learns each new MinAtar game at 105% of scratch, but the final score falls to 25.3% (Table IV); on MiniGrid C1 it falls to 39.0%. The reset brings back the ability to learn; the memory carries the past.</w:t>
       </w:r>
     </w:p>
     <w:p>
@@ -4678,7 +7304,7 @@
           <w:sz w:val="20"/>
           <w:szCs w:val="20"/>
         </w:rPr>
-        <w:t xml:space="preserve">On MiniGrid C1 without protection, learning the third task tracks the policy entropy at its start: with entropy 0.01 (of 1.95) 0/10 seeds learn it; resetting the output heads restores entropy to 1.83 and learning on 10/10 seeds (Fig. 4). On MinAtar, entropy is not collapsed (1.2–1.4 of 1.79), dormant units stay below 2%, and ReDo [14] every 10 rollouts gives no gain (25.6 vs. 28.4, tuning seeds). Only a full reset helps: +15.0 ± 5.4 over the head reset (5/5 tuning seeds) and +14.6 ± 2.5 on final seeds (10/10). The rule, fixed before running, was to adopt a fix only if it beat the head reset on MinAtar and was not more than 5 points worse on MiniGrid L1; the full reset scored 92.5 vs. 92.5 on L1 and 96.1 vs. 97.1 on C1.</w:t>
+        <w:t xml:space="preserve">On MiniGrid C1 without protection, learning the third task tracks the policy entropy at its start: with entropy 0.01 (of 1.95) 0/10 seeds learn it; resetting the output heads restores entropy to 1.83 and learning on 10/10 seeds (Fig. 4). On MinAtar, entropy is not collapsed (1.2–1.4 of 1.79), dormant units stay below 2%, and ReDo [15] every 10 rollouts gives no gain (25.6 vs. 28.4, tuning seeds). Only a full reset helps: +15.0 ± 5.4 over the head reset (5/5 tuning seeds) and +14.6 ± 2.5 on final seeds (10/10). The rule, fixed before running, was to adopt a fix only if it beat the head reset on MinAtar and was not more than 5 points worse on MiniGrid L1; the full reset scored 92.5 vs. 92.5 on L1 and 96.1 vs. 97.1 on C1.</w:t>
       </w:r>
     </w:p>
     <w:p>
@@ -4778,7 +7404,7 @@
           <w:sz w:val="20"/>
           <w:szCs w:val="20"/>
         </w:rPr>
-        <w:t xml:space="preserve">Reset &amp; Distill [4], told each task end, matches ours on MinAtar (45.1 vs. 44.4, n.s.) but is lower on average on MiniGrid (L1 87.1 vs. 92.7, +5.6 ± 5.5, 15/20; C1 89.4 vs. 96.4, +7.0 ± 5.6, 17/20). It loses an early skill on 2 of 20 seeds in each MiniGrid setup (worst 55%). On seeds 1–10 this happened on 2 of 10 seeds, but on none of the replication seeds, so we weakened this claim. Told distillation drops on the same two C1 seeds (63% and 58%); ours never falls below 89% (L1) or 91% (C1). With our memory, the told reset has no collapses (worst seed 77 and 92), so the memory, not the boundary signal, prevents them.</w:t>
+        <w:t xml:space="preserve">Reset &amp; Distill [5], told each task end, matches ours on MinAtar (45.1 vs. 44.4, n.s.) but is lower on average on MiniGrid (L1 87.1 vs. 92.7, +5.6 ± 5.5, 15/20; C1 89.4 vs. 96.4, +7.0 ± 5.6, 17/20). It loses an early skill on 2 of 20 seeds in each MiniGrid setup (worst 55%). On seeds 1–10 this happened on 2 of 10 seeds, but on none of the replication seeds, so we weakened this claim. Told distillation drops on the same two C1 seeds (63% and 58%); ours never falls below 89% (L1) or 91% (C1). With our memory, the told reset has no collapses (worst seed 77 and 92), so the memory, not the boundary signal, prevents them.</w:t>
       </w:r>
     </w:p>
     <w:p>
@@ -4892,7 +7518,7 @@
     <w:p>
       <w:pPr>
         <w:keepNext/>
-        <w:spacing w:after="80" w:before="160"/>
+        <w:spacing w:after="20" w:before="160"/>
         <w:jc w:val="center"/>
       </w:pPr>
       <w:r>
@@ -4903,6 +7529,41 @@
           <w:szCs w:val="20"/>
         </w:rPr>
         <w:t xml:space="preserve">VII. Limitations</w:t>
+      </w:r>
+    </w:p>
+    <w:p>
+      <w:pPr>
+        <w:keepNext/>
+        <w:spacing w:after="60" w:before="0"/>
+        <w:jc w:val="center"/>
+      </w:pPr>
+      <w:r>
+        <w:rPr>
+          <w:rFonts w:ascii="Times New Roman" w:cs="Times New Roman" w:eastAsia="Times New Roman" w:hAnsi="Times New Roman"/>
+          <w:i/>
+          <w:iCs/>
+          <w:sz w:val="16"/>
+          <w:szCs w:val="16"/>
+        </w:rPr>
+        <w:t xml:space="preserve">AI-generated text in this section</w:t>
+      </w:r>
+      <w:r>
+        <w:rPr>
+          <w:rFonts w:ascii="Times New Roman" w:cs="Times New Roman" w:eastAsia="Times New Roman" w:hAnsi="Times New Roman"/>
+          <w:sz w:val="16"/>
+          <w:szCs w:val="16"/>
+        </w:rPr>
+        <w:t xml:space="preserve"> [1]</w:t>
+      </w:r>
+      <w:r>
+        <w:rPr>
+          <w:rFonts w:ascii="Times New Roman" w:cs="Times New Roman" w:eastAsia="Times New Roman" w:hAnsi="Times New Roman"/>
+          <w:i/>
+          <w:iCs/>
+          <w:sz w:val="16"/>
+          <w:szCs w:val="16"/>
+        </w:rPr>
+        <w:t xml:space="preserve">.</w:t>
       </w:r>
     </w:p>
     <w:p>
@@ -4917,7 +7578,97 @@
           <w:sz w:val="20"/>
           <w:szCs w:val="20"/>
         </w:rPr>
-        <w:t xml:space="preserve">Networks and worlds are small (MiniGrid, MinAtar), with one RL algorithm (PPO) and one set of hyperparameters. The thresholds (0.8, 0.3) and λ were set once on MiniGrid, although sensitivity is low. A slow drift that never drops competence below 0.3 would not trigger a reset (not tested). A full reset discards useful features (Sec. VI-F); choosing what to reset is open. Retention on MinAtar is partial. CLEAR and Reset &amp; Distill are our PPO adaptations, not the original implementations, and joint training is not an upper bound on MinAtar [16].</w:t>
+        <w:t xml:space="preserve">Networks and worlds are small (MiniGrid, MinAtar), with one RL algorithm (PPO) and one set of hyperparameters. The thresholds (0.8, 0.3) and λ were set once on MiniGrid, although sensitivity is low. A slow drift that never drops competence below 0.3 would not trigger a reset (not tested). A full reset discards useful features (Sec. VI-F); choosing what to reset is open. Retention on MinAtar is partial. CLEAR and Reset &amp; Distill are our PPO adaptations, not the original implementations, and joint training is not an upper bound on MinAtar.</w:t>
+      </w:r>
+    </w:p>
+    <w:p>
+      <w:pPr>
+        <w:keepNext/>
+        <w:spacing w:after="20" w:before="160"/>
+        <w:jc w:val="center"/>
+      </w:pPr>
+      <w:r>
+        <w:rPr>
+          <w:rFonts w:ascii="Times New Roman" w:cs="Times New Roman" w:eastAsia="Times New Roman" w:hAnsi="Times New Roman"/>
+          <w:smallCaps/>
+          <w:sz w:val="20"/>
+          <w:szCs w:val="20"/>
+        </w:rPr>
+        <w:t xml:space="preserve">VIII. Conclusion</w:t>
+      </w:r>
+    </w:p>
+    <w:p>
+      <w:pPr>
+        <w:keepNext/>
+        <w:spacing w:after="60" w:before="0"/>
+        <w:jc w:val="center"/>
+      </w:pPr>
+      <w:r>
+        <w:rPr>
+          <w:rFonts w:ascii="Times New Roman" w:cs="Times New Roman" w:eastAsia="Times New Roman" w:hAnsi="Times New Roman"/>
+          <w:i/>
+          <w:iCs/>
+          <w:sz w:val="16"/>
+          <w:szCs w:val="16"/>
+        </w:rPr>
+        <w:t xml:space="preserve">AI-generated text in this section</w:t>
+      </w:r>
+      <w:r>
+        <w:rPr>
+          <w:rFonts w:ascii="Times New Roman" w:cs="Times New Roman" w:eastAsia="Times New Roman" w:hAnsi="Times New Roman"/>
+          <w:sz w:val="16"/>
+          <w:szCs w:val="16"/>
+        </w:rPr>
+        <w:t xml:space="preserve"> [1]</w:t>
+      </w:r>
+      <w:r>
+        <w:rPr>
+          <w:rFonts w:ascii="Times New Roman" w:cs="Times New Roman" w:eastAsia="Times New Roman" w:hAnsi="Times New Roman"/>
+          <w:i/>
+          <w:iCs/>
+          <w:sz w:val="16"/>
+          <w:szCs w:val="16"/>
+        </w:rPr>
+        <w:t xml:space="preserve">.</w:t>
+      </w:r>
+    </w:p>
+    <w:p>
+      <w:pPr>
+        <w:spacing w:after="0" w:before="0" w:line="240" w:lineRule="auto"/>
+        <w:ind w:firstLine="202"/>
+        <w:jc w:val="both"/>
+      </w:pPr>
+      <w:r>
+        <w:rPr>
+          <w:rFonts w:ascii="Times New Roman" w:cs="Times New Roman" w:eastAsia="Times New Roman" w:hAnsi="Times New Roman"/>
+          <w:sz w:val="20"/>
+          <w:szCs w:val="20"/>
+        </w:rPr>
+        <w:t xml:space="preserve">An agent told nothing about task changes can, with a small self-triggered loop (remember what you master, distil toward it, restart when the world surprises you), match learners that are told the boundaries and beat CLEAR on two domains, with results replicated on new seeds. Memory carries the past; the reset carries the future. Next, we will ground language instructions in the same continual agent.</w:t>
+      </w:r>
+    </w:p>
+    <w:p>
+      <w:pPr>
+        <w:spacing w:after="0" w:before="80" w:line="240" w:lineRule="auto"/>
+        <w:jc w:val="both"/>
+      </w:pPr>
+      <w:r>
+        <w:rPr>
+          <w:rFonts w:ascii="Times New Roman" w:cs="Times New Roman" w:eastAsia="Times New Roman" w:hAnsi="Times New Roman"/>
+          <w:b/>
+          <w:bCs/>
+          <w:sz w:val="20"/>
+          <w:szCs w:val="20"/>
+        </w:rPr>
+        <w:t xml:space="preserve">Reproducibility.</w:t>
+      </w:r>
+      <w:r>
+        <w:rPr>
+          <w:rFonts w:ascii="Times New Roman" w:cs="Times New Roman" w:eastAsia="Times New Roman" w:hAnsi="Times New Roman"/>
+          <w:sz w:val="20"/>
+          <w:szCs w:val="20"/>
+        </w:rPr>
+        <w:t xml:space="preserve"> Code, configurations, per-seed result files and logs for all runs will be released with the paper.</w:t>
       </w:r>
     </w:p>
     <w:p>
@@ -4933,7 +7684,7 @@
           <w:sz w:val="20"/>
           <w:szCs w:val="20"/>
         </w:rPr>
-        <w:t xml:space="preserve">VIII. Conclusion</w:t>
+        <w:t xml:space="preserve">Acknowledgment</w:t>
       </w:r>
     </w:p>
     <w:p>
@@ -4948,62 +7699,7 @@
           <w:sz w:val="20"/>
           <w:szCs w:val="20"/>
         </w:rPr>
-        <w:t xml:space="preserve">An agent told nothing about task changes can, with a small self-triggered loop (remember what you master, distil toward it, restart when the world surprises you), match learners that are told the boundaries and beat CLEAR on two domains, with results replicated on new seeds. Memory carries the past; the reset carries the future. Next, we will ground language instructions in the same continual agent [16].</w:t>
-      </w:r>
-    </w:p>
-    <w:p>
-      <w:pPr>
-        <w:spacing w:after="0" w:before="80" w:line="240" w:lineRule="auto"/>
-        <w:jc w:val="both"/>
-      </w:pPr>
-      <w:r>
-        <w:rPr>
-          <w:rFonts w:ascii="Times New Roman" w:cs="Times New Roman" w:eastAsia="Times New Roman" w:hAnsi="Times New Roman"/>
-          <w:b/>
-          <w:bCs/>
-          <w:sz w:val="20"/>
-          <w:szCs w:val="20"/>
-        </w:rPr>
-        <w:t xml:space="preserve">Reproducibility.</w:t>
-      </w:r>
-      <w:r>
-        <w:rPr>
-          <w:rFonts w:ascii="Times New Roman" w:cs="Times New Roman" w:eastAsia="Times New Roman" w:hAnsi="Times New Roman"/>
-          <w:sz w:val="20"/>
-          <w:szCs w:val="20"/>
-        </w:rPr>
-        <w:t xml:space="preserve"> Code, configurations, per-seed result files and logs for all runs will be released with the paper.</w:t>
-      </w:r>
-    </w:p>
-    <w:p>
-      <w:pPr>
-        <w:keepNext/>
-        <w:spacing w:after="80" w:before="160"/>
-        <w:jc w:val="center"/>
-      </w:pPr>
-      <w:r>
-        <w:rPr>
-          <w:rFonts w:ascii="Times New Roman" w:cs="Times New Roman" w:eastAsia="Times New Roman" w:hAnsi="Times New Roman"/>
-          <w:smallCaps/>
-          <w:sz w:val="20"/>
-          <w:szCs w:val="20"/>
-        </w:rPr>
-        <w:t xml:space="preserve">Acknowledgment</w:t>
-      </w:r>
-    </w:p>
-    <w:p>
-      <w:pPr>
-        <w:spacing w:after="0" w:before="0" w:line="240" w:lineRule="auto"/>
-        <w:ind w:firstLine="202"/>
-        <w:jc w:val="both"/>
-      </w:pPr>
-      <w:r>
-        <w:rPr>
-          <w:rFonts w:ascii="Times New Roman" w:cs="Times New Roman" w:eastAsia="Times New Roman" w:hAnsi="Times New Roman"/>
-          <w:sz w:val="20"/>
-          <w:szCs w:val="20"/>
-        </w:rPr>
-        <w:t xml:space="preserve">The text of all sections of this paper was generated with the AI system Claude Opus 5.5 [16], working from the authors' experiment reports; the same system also wrote the experiment, analysis and figure code under the authors' direction. The authors reviewed the paper and take full responsibility for its content.</w:t>
+        <w:t xml:space="preserve">The text of all sections of this paper was generated with the AI system Claude Opus 5.5 [1], working from the authors' experiment reports; the same system also wrote the experiment, analysis and figure code under the authors' direction. The authors reviewed the paper and take full responsibility for its content.</w:t>
       </w:r>
     </w:p>
     <w:p>
@@ -5036,7 +7732,7 @@
           <w:sz w:val="16"/>
           <w:szCs w:val="16"/>
         </w:rPr>
-        <w:t xml:space="preserve">[1]	K. Khetarpal, M. Riemer, I. Rish, and D. Precup, "Towards continual reinforcement learning: A review and perspectives," J. Artif. Intell. Res., vol. 75, pp. 1401–1476, 2022.</w:t>
+        <w:t xml:space="preserve">[1]	Anthropic, "Claude Opus 5.5 (claude-opus-5-5)," large language model, 2026. [Online]. Available: https://www.anthropic.com/claude</w:t>
       </w:r>
     </w:p>
     <w:p>
@@ -5054,7 +7750,7 @@
           <w:sz w:val="16"/>
           <w:szCs w:val="16"/>
         </w:rPr>
-        <w:t xml:space="preserve">[2]	J. Kirkpatrick et al., "Overcoming catastrophic forgetting in neural networks," Proc. Natl. Acad. Sci., vol. 114, no. 13, pp. 3521–3526, 2017.</w:t>
+        <w:t xml:space="preserve">[2]	K. Khetarpal, M. Riemer, I. Rish, and D. Precup, "Towards continual reinforcement learning: A review and perspectives," J. Artif. Intell. Res., vol. 75, pp. 1401–1476, 2022.</w:t>
       </w:r>
     </w:p>
     <w:p>
@@ -5072,7 +7768,7 @@
           <w:sz w:val="16"/>
           <w:szCs w:val="16"/>
         </w:rPr>
-        <w:t xml:space="preserve">[3]	J. Schwarz et al., "Progress &amp; compress: A scalable framework for continual learning," in Proc. ICML, PMLR 80, 2018, pp. 4528–4537.</w:t>
+        <w:t xml:space="preserve">[3]	J. Kirkpatrick et al., "Overcoming catastrophic forgetting in neural networks," Proc. Natl. Acad. Sci., vol. 114, no. 13, pp. 3521–3526, 2017.</w:t>
       </w:r>
     </w:p>
     <w:p>
@@ -5090,7 +7786,7 @@
           <w:sz w:val="16"/>
           <w:szCs w:val="16"/>
         </w:rPr>
-        <w:t xml:space="preserve">[4]	H. Ahn, J. Hyeon, Y. Oh, B. Hwang, and T. Moon, "Reset &amp; distill: A recipe for overcoming negative transfer in continual reinforcement learning," arXiv:2403.05066, 2024.</w:t>
+        <w:t xml:space="preserve">[4]	J. Schwarz et al., "Progress &amp; compress: A scalable framework for continual learning," in Proc. ICML, PMLR 80, 2018, pp. 4528–4537.</w:t>
       </w:r>
     </w:p>
     <w:p>
@@ -5108,7 +7804,7 @@
           <w:sz w:val="16"/>
           <w:szCs w:val="16"/>
         </w:rPr>
-        <w:t xml:space="preserve">[5]	R. Aljundi, K. Kelchtermans, and T. Tuytelaars, "Task-free continual learning," in Proc. IEEE/CVF CVPR, 2019, pp. 11254–11263.</w:t>
+        <w:t xml:space="preserve">[5]	H. Ahn, J. Hyeon, Y. Oh, B. Hwang, and T. Moon, "Reset &amp; distill: A recipe for overcoming negative transfer in continual reinforcement learning," arXiv:2403.05066, 2024.</w:t>
       </w:r>
     </w:p>
     <w:p>
@@ -5126,7 +7822,7 @@
           <w:sz w:val="16"/>
           <w:szCs w:val="16"/>
         </w:rPr>
-        <w:t xml:space="preserve">[6]	D. Rao, F. Visin, A. Rusu, R. Pascanu, Y. W. Teh, and R. Hadsell, "Continual unsupervised representation learning," in Proc. NeurIPS, vol. 32, 2019.</w:t>
+        <w:t xml:space="preserve">[6]	R. Aljundi, K. Kelchtermans, and T. Tuytelaars, "Task-free continual learning," in Proc. IEEE/CVF CVPR, 2019, pp. 11254–11263.</w:t>
       </w:r>
     </w:p>
     <w:p>
@@ -5144,7 +7840,7 @@
           <w:sz w:val="16"/>
           <w:szCs w:val="16"/>
         </w:rPr>
-        <w:t xml:space="preserve">[7]	S. Kessler, J. Parker-Holder, P. Ball, S. Zohren, and S. J. Roberts, "Same state, different task: Continual reinforcement learning without interference," in Proc. AAAI, 2022.</w:t>
+        <w:t xml:space="preserve">[7]	D. Rao, F. Visin, A. Rusu, R. Pascanu, Y. W. Teh, and R. Hadsell, "Continual unsupervised representation learning," in Proc. NeurIPS, vol. 32, 2019.</w:t>
       </w:r>
     </w:p>
     <w:p>
@@ -5162,7 +7858,7 @@
           <w:sz w:val="16"/>
           <w:szCs w:val="16"/>
         </w:rPr>
-        <w:t xml:space="preserve">[8]	M. Caccia, J. Mueller, T. Kim, L. Charlin, and R. Fakoor, "Task-agnostic continual reinforcement learning: Gaining insights and overcoming challenges," in Proc. CoLLAs, PMLR 232, 2023, pp. 89–119.</w:t>
+        <w:t xml:space="preserve">[8]	S. Kessler, J. Parker-Holder, P. Ball, S. Zohren, and S. J. Roberts, "Same state, different task: Continual reinforcement learning without interference," in Proc. AAAI, 2022.</w:t>
       </w:r>
     </w:p>
     <w:p>
@@ -5180,7 +7876,7 @@
           <w:sz w:val="16"/>
           <w:szCs w:val="16"/>
         </w:rPr>
-        <w:t xml:space="preserve">[9]	J. Dick, S. Nath, C. Peridis, E. Benjamin, S. Kolouri, and A. Soltoggio, "Statistical context detection for deep lifelong reinforcement learning," in Proc. CoLLAs, 2024.</w:t>
+        <w:t xml:space="preserve">[9]	M. Caccia, J. Mueller, T. Kim, L. Charlin, and R. Fakoor, "Task-agnostic continual reinforcement learning: Gaining insights and overcoming challenges," in Proc. CoLLAs, PMLR 232, 2023, pp. 89–119.</w:t>
       </w:r>
     </w:p>
     <w:p>
@@ -5198,7 +7894,7 @@
           <w:sz w:val="16"/>
           <w:szCs w:val="16"/>
         </w:rPr>
-        <w:t xml:space="preserve">[10]	D. Rolnick, A. Ahuja, J. Schwarz, T. Lillicrap, and G. Wayne, "Experience replay for continual learning," in Proc. NeurIPS, vol. 32, 2019, pp. 350–360.</w:t>
+        <w:t xml:space="preserve">[10]	J. Dick, S. Nath, C. Peridis, E. Benjamin, S. Kolouri, and A. Soltoggio, "Statistical context detection for deep lifelong reinforcement learning," in Proc. CoLLAs, 2024.</w:t>
       </w:r>
     </w:p>
     <w:p>
@@ -5216,7 +7912,7 @@
           <w:sz w:val="16"/>
           <w:szCs w:val="16"/>
         </w:rPr>
-        <w:t xml:space="preserve">[11]	S. Dohare, J. F. Hernandez-Garcia, Q. Lan, P. Rahman, A. R. Mahmood, and R. S. Sutton, "Loss of plasticity in deep continual learning," Nature, vol. 632, pp. 768–774, 2024.</w:t>
+        <w:t xml:space="preserve">[11]	D. Rolnick, A. Ahuja, J. Schwarz, T. Lillicrap, and G. Wayne, "Experience replay for continual learning," in Proc. NeurIPS, vol. 32, 2019, pp. 350–360.</w:t>
       </w:r>
     </w:p>
     <w:p>
@@ -5234,7 +7930,7 @@
           <w:sz w:val="16"/>
           <w:szCs w:val="16"/>
         </w:rPr>
-        <w:t xml:space="preserve">[12]	C. Lyle, Z. Zheng, E. Nikishin, B. Avila Pires, R. Pascanu, and W. Dabney, "Understanding plasticity in neural networks," in Proc. ICML, PMLR 202, 2023, pp. 23190–23211.</w:t>
+        <w:t xml:space="preserve">[12]	S. Dohare, J. F. Hernandez-Garcia, Q. Lan, P. Rahman, A. R. Mahmood, and R. S. Sutton, "Loss of plasticity in deep continual learning," Nature, vol. 632, pp. 768–774, 2024.</w:t>
       </w:r>
     </w:p>
     <w:p>
@@ -5252,7 +7948,7 @@
           <w:sz w:val="16"/>
           <w:szCs w:val="16"/>
         </w:rPr>
-        <w:t xml:space="preserve">[13]	Z. Abbas, R. Zhao, J. Modayil, A. White, and M. C. Machado, "Loss of plasticity in continual deep reinforcement learning," in Proc. CoLLAs, PMLR 232, 2023, pp. 620–636.</w:t>
+        <w:t xml:space="preserve">[13]	C. Lyle, Z. Zheng, E. Nikishin, B. Avila Pires, R. Pascanu, and W. Dabney, "Understanding plasticity in neural networks," in Proc. ICML, PMLR 202, 2023, pp. 23190–23211.</w:t>
       </w:r>
     </w:p>
     <w:p>
@@ -5270,7 +7966,7 @@
           <w:sz w:val="16"/>
           <w:szCs w:val="16"/>
         </w:rPr>
-        <w:t xml:space="preserve">[14]	G. Sokar, R. Agarwal, P. S. Castro, and U. Evci, "The dormant neuron phenomenon in deep reinforcement learning," in Proc. ICML, PMLR 202, 2023, pp. 32145–32168.</w:t>
+        <w:t xml:space="preserve">[14]	Z. Abbas, R. Zhao, J. Modayil, A. White, and M. C. Machado, "Loss of plasticity in continual deep reinforcement learning," in Proc. CoLLAs, PMLR 232, 2023, pp. 620–636.</w:t>
       </w:r>
     </w:p>
     <w:p>
@@ -5288,7 +7984,7 @@
           <w:sz w:val="16"/>
           <w:szCs w:val="16"/>
         </w:rPr>
-        <w:t xml:space="preserve">[15]	E. Nikishin, M. Schwarzer, P. D'Oro, P.-L. Bacon, and A. Courville, "The primacy bias in deep reinforcement learning," in Proc. ICML, PMLR 162, 2022, pp. 16828–16847.</w:t>
+        <w:t xml:space="preserve">[15]	G. Sokar, R. Agarwal, P. S. Castro, and U. Evci, "The dormant neuron phenomenon in deep reinforcement learning," in Proc. ICML, PMLR 202, 2023, pp. 32145–32168.</w:t>
       </w:r>
     </w:p>
     <w:p>
@@ -5306,7 +8002,7 @@
           <w:sz w:val="16"/>
           <w:szCs w:val="16"/>
         </w:rPr>
-        <w:t xml:space="preserve">[16]	Anthropic, "Claude Opus 5.5 (claude-opus-5-5)," large language model, 2026. [Online]. Available: https://www.anthropic.com/claude</w:t>
+        <w:t xml:space="preserve">[16]	E. Nikishin, M. Schwarzer, P. D'Oro, P.-L. Bacon, and A. Courville, "The primacy bias in deep reinforcement learning," in Proc. ICML, PMLR 162, 2022, pp. 16828–16847.</w:t>
       </w:r>
     </w:p>
     <w:p>

</xml_diff>